<commit_message>
docs: actualiza documentacion Fase 2 BARB
</commit_message>
<xml_diff>
--- a/Fase 2/Evidencias Individuales/Ovalle_Luis_2.1_APT122_DiarioReflexionFase2.docx
+++ b/Fase 2/Evidencias Individuales/Ovalle_Luis_2.1_APT122_DiarioReflexionFase2.docx
@@ -1,6 +1,6 @@
 
 <file path=word/document.xml><?xml version="1.0" encoding="utf-8"?>
-<w:document xmlns:wpc="http://schemas.microsoft.com/office/word/2010/wordprocessingCanvas" xmlns:cx="http://schemas.microsoft.com/office/drawing/2014/chartex" xmlns:mc="http://schemas.openxmlformats.org/markup-compatibility/2006" xmlns:o="urn:schemas-microsoft-com:office:office" xmlns:r="http://schemas.openxmlformats.org/officeDocument/2006/relationships" xmlns:m="http://schemas.openxmlformats.org/officeDocument/2006/math" xmlns:v="urn:schemas-microsoft-com:vml" xmlns:wp14="http://schemas.microsoft.com/office/word/2010/wordprocessingDrawing" xmlns:wp="http://schemas.openxmlformats.org/drawingml/2006/wordprocessingDrawing" xmlns:w10="urn:schemas-microsoft-com:office:word" xmlns:w="http://schemas.openxmlformats.org/wordprocessingml/2006/main" xmlns:w14="http://schemas.microsoft.com/office/word/2010/wordml" xmlns:w15="http://schemas.microsoft.com/office/word/2012/wordml" xmlns:w16se="http://schemas.microsoft.com/office/word/2015/wordml/symex" xmlns:wpg="http://schemas.microsoft.com/office/word/2010/wordprocessingGroup" xmlns:wpi="http://schemas.microsoft.com/office/word/2010/wordprocessingInk" xmlns:wne="http://schemas.microsoft.com/office/word/2006/wordml" xmlns:wps="http://schemas.microsoft.com/office/word/2010/wordprocessingShape" mc:Ignorable="w14 w15 w16se wp14">
+<w:document xmlns:wpc="http://schemas.microsoft.com/office/word/2010/wordprocessingCanvas" xmlns:cx="http://schemas.microsoft.com/office/drawing/2014/chartex" xmlns:cx1="http://schemas.microsoft.com/office/drawing/2015/9/8/chartex" xmlns:cx2="http://schemas.microsoft.com/office/drawing/2015/10/21/chartex" xmlns:cx3="http://schemas.microsoft.com/office/drawing/2016/5/9/chartex" xmlns:cx4="http://schemas.microsoft.com/office/drawing/2016/5/10/chartex" xmlns:cx5="http://schemas.microsoft.com/office/drawing/2016/5/11/chartex" xmlns:cx6="http://schemas.microsoft.com/office/drawing/2016/5/12/chartex" xmlns:cx7="http://schemas.microsoft.com/office/drawing/2016/5/13/chartex" xmlns:cx8="http://schemas.microsoft.com/office/drawing/2016/5/14/chartex" xmlns:mc="http://schemas.openxmlformats.org/markup-compatibility/2006" xmlns:aink="http://schemas.microsoft.com/office/drawing/2016/ink" xmlns:am3d="http://schemas.microsoft.com/office/drawing/2017/model3d" xmlns:o="urn:schemas-microsoft-com:office:office" xmlns:oel="http://schemas.microsoft.com/office/2019/extlst" xmlns:r="http://schemas.openxmlformats.org/officeDocument/2006/relationships" xmlns:m="http://schemas.openxmlformats.org/officeDocument/2006/math" xmlns:v="urn:schemas-microsoft-com:vml" xmlns:wp14="http://schemas.microsoft.com/office/word/2010/wordprocessingDrawing" xmlns:wp="http://schemas.openxmlformats.org/drawingml/2006/wordprocessingDrawing" xmlns:w10="urn:schemas-microsoft-com:office:word" xmlns:w="http://schemas.openxmlformats.org/wordprocessingml/2006/main" xmlns:w14="http://schemas.microsoft.com/office/word/2010/wordml" xmlns:w15="http://schemas.microsoft.com/office/word/2012/wordml" xmlns:w16cex="http://schemas.microsoft.com/office/word/2018/wordml/cex" xmlns:w16cid="http://schemas.microsoft.com/office/word/2016/wordml/cid" xmlns:w16="http://schemas.microsoft.com/office/word/2018/wordml" xmlns:w16du="http://schemas.microsoft.com/office/word/2023/wordml/word16du" xmlns:w16sdtdh="http://schemas.microsoft.com/office/word/2020/wordml/sdtdatahash" xmlns:w16sdtfl="http://schemas.microsoft.com/office/word/2024/wordml/sdtformatlock" xmlns:w16se="http://schemas.microsoft.com/office/word/2015/wordml/symex" xmlns:wpg="http://schemas.microsoft.com/office/word/2010/wordprocessingGroup" xmlns:wpi="http://schemas.microsoft.com/office/word/2010/wordprocessingInk" xmlns:wne="http://schemas.microsoft.com/office/word/2006/wordml" xmlns:wps="http://schemas.microsoft.com/office/word/2010/wordprocessingShape" mc:Ignorable="w14 w15 w16se w16cid w16 w16cex w16sdtdh w16sdtfl w16du wp14">
   <w:body>
     <w:p/>
     <w:tbl>
@@ -121,7 +121,25 @@
                 <w:sz w:val="24"/>
                 <w:szCs w:val="24"/>
               </w:rPr>
-              <w:t xml:space="preserve">Esta pauta tiene como objetivo ayudarte a monitorear el desarrollo de tu Proyecto APT, reflexionando sobre tus avances de acuerdo con lo planificado en la fase anterior y recibiendo retroalimentación de tus pares y docentes que te permita hacer los ajustes necesarios para cumplir con los objetivos de tu proyecto. Esta pauta debe ser respondida </w:t>
+              <w:t xml:space="preserve">Esta pauta tiene como objetivo ayudarte a monitorear el desarrollo de tu Proyecto APT, reflexionando sobre tus avances de acuerdo con lo planificado en la fase anterior y recibiendo retroalimentación de tus </w:t>
+            </w:r>
+            <w:proofErr w:type="spellStart"/>
+            <w:r>
+              <w:rPr>
+                <w:rFonts w:eastAsiaTheme="majorEastAsia"/>
+                <w:sz w:val="24"/>
+                <w:szCs w:val="24"/>
+              </w:rPr>
+              <w:t>pares</w:t>
+            </w:r>
+            <w:proofErr w:type="spellEnd"/>
+            <w:r>
+              <w:rPr>
+                <w:rFonts w:eastAsiaTheme="majorEastAsia"/>
+                <w:sz w:val="24"/>
+                <w:szCs w:val="24"/>
+              </w:rPr>
+              <w:t xml:space="preserve"> y docentes que te permita hacer los ajustes necesarios para cumplir con los objetivos de tu proyecto. Esta pauta debe ser respondida </w:t>
             </w:r>
             <w:r>
               <w:rPr>
@@ -286,7 +304,25 @@
                 <w:sz w:val="24"/>
                 <w:szCs w:val="24"/>
               </w:rPr>
-              <w:t>1. Mira tu carta Gantt y reflexiona sobre los avances de tu Proyecto APT</w:t>
+              <w:t xml:space="preserve">1. Mira </w:t>
+            </w:r>
+            <w:proofErr w:type="spellStart"/>
+            <w:r>
+              <w:rPr>
+                <w:rFonts w:eastAsiaTheme="majorEastAsia"/>
+                <w:sz w:val="24"/>
+                <w:szCs w:val="24"/>
+              </w:rPr>
+              <w:t>tu</w:t>
+            </w:r>
+            <w:proofErr w:type="spellEnd"/>
+            <w:r>
+              <w:rPr>
+                <w:rFonts w:eastAsiaTheme="majorEastAsia"/>
+                <w:sz w:val="24"/>
+                <w:szCs w:val="24"/>
+              </w:rPr>
+              <w:t xml:space="preserve"> carta Gantt y reflexiona sobre los avances de tu Proyecto APT</w:t>
             </w:r>
           </w:p>
         </w:tc>
@@ -322,47 +358,67 @@
           </w:p>
           <w:p>
             <w:pPr>
+              <w:spacing w:before="120"/>
               <w:jc w:val="both"/>
+            </w:pPr>
+            <w:r>
+              <w:rPr>
+                <w:rFonts w:ascii="Calibri" w:hAnsi="Calibri"/>
+                <w:sz w:val="21"/>
+              </w:rPr>
+              <w:t>Respuesta:</w:t>
+            </w:r>
+            <w:r>
+              <w:rPr>
+                <w:rFonts w:ascii="Calibri" w:hAnsi="Calibri"/>
+                <w:sz w:val="21"/>
+              </w:rPr>
+              <w:br/>
+            </w:r>
+            <w:r>
               <w:rPr>
                 <w:rFonts w:eastAsiaTheme="majorEastAsia"/>
-                <w:color w:val="767171" w:themeColor="background2" w:themeShade="80"/>
                 <w:sz w:val="24"/>
                 <w:szCs w:val="24"/>
               </w:rPr>
-            </w:pPr>
-          </w:p>
-          <w:p>
-            <w:pPr>
-              <w:jc w:val="both"/>
+              <w:t xml:space="preserve">No hemos podido cumplir completamente la carta Gantt en los tiempos definidos. La planificación original ubicaba la PWA y el trabajo offline antes del RAG, PDF e integración, pero fue necesario detener esa secuencia para estabilizar la base heredada de BARB. Esta decisión permitió corregir problemas de arranque, persistencia PostgreSQL, contratos de usuarios y OT, fotografías, autoría y auditoría, cerrando P0.7 con 106 pruebas </w:t>
+            </w:r>
+            <w:proofErr w:type="spellStart"/>
+            <w:r>
               <w:rPr>
-                <w:rFonts w:ascii="Calibri" w:hAnsi="Calibri"/>
-                <w:b/>
-                <w:bCs/>
-                <w:color w:val="1F4E79" w:themeColor="accent1" w:themeShade="80"/>
+                <w:rFonts w:eastAsiaTheme="majorEastAsia"/>
+                <w:sz w:val="24"/>
+                <w:szCs w:val="24"/>
               </w:rPr>
-            </w:pPr>
-          </w:p>
-          <w:p>
-            <w:pPr>
-              <w:jc w:val="both"/>
+              <w:t>backend</w:t>
+            </w:r>
+            <w:proofErr w:type="spellEnd"/>
+            <w:r>
               <w:rPr>
-                <w:rFonts w:ascii="Calibri" w:hAnsi="Calibri"/>
-                <w:b/>
-                <w:bCs/>
-                <w:color w:val="1F4E79" w:themeColor="accent1" w:themeShade="80"/>
+                <w:rFonts w:eastAsiaTheme="majorEastAsia"/>
+                <w:sz w:val="24"/>
+                <w:szCs w:val="24"/>
               </w:rPr>
-            </w:pPr>
-          </w:p>
-          <w:p>
-            <w:pPr>
-              <w:jc w:val="both"/>
+              <w:t xml:space="preserve"> aprobadas y llegando posteriormente a un último registro de 108 pruebas. Como facilitadores destaco el uso de Git, ramas y Pull </w:t>
+            </w:r>
+            <w:proofErr w:type="spellStart"/>
+            <w:r>
               <w:rPr>
-                <w:rFonts w:ascii="Calibri" w:hAnsi="Calibri"/>
-                <w:b/>
-                <w:bCs/>
-                <w:color w:val="1F4E79" w:themeColor="accent1" w:themeShade="80"/>
+                <w:rFonts w:eastAsiaTheme="majorEastAsia"/>
+                <w:sz w:val="24"/>
+                <w:szCs w:val="24"/>
               </w:rPr>
-            </w:pPr>
+              <w:t>Requests</w:t>
+            </w:r>
+            <w:proofErr w:type="spellEnd"/>
+            <w:r>
+              <w:rPr>
+                <w:rFonts w:eastAsiaTheme="majorEastAsia"/>
+                <w:sz w:val="24"/>
+                <w:szCs w:val="24"/>
+              </w:rPr>
+              <w:t>, las pruebas automatizadas y el trabajo incremental. Como dificultad principal, la estabilización consumió tiempo que originalmente estaba destinado a los incrementos funcionales y además el trabajo se concentró inicialmente en un integrante.</w:t>
+            </w:r>
           </w:p>
         </w:tc>
       </w:tr>
@@ -458,47 +514,67 @@
           </w:p>
           <w:p>
             <w:pPr>
+              <w:spacing w:before="120"/>
               <w:jc w:val="both"/>
+            </w:pPr>
+            <w:r>
               <w:rPr>
                 <w:rFonts w:ascii="Calibri" w:hAnsi="Calibri"/>
-                <w:b/>
-                <w:bCs/>
-                <w:color w:val="1F4E79" w:themeColor="accent1" w:themeShade="80"/>
+                <w:sz w:val="21"/>
               </w:rPr>
-            </w:pPr>
-          </w:p>
-          <w:p>
-            <w:pPr>
-              <w:jc w:val="both"/>
+              <w:t>Respuesta:</w:t>
+            </w:r>
+            <w:r>
               <w:rPr>
                 <w:rFonts w:ascii="Calibri" w:hAnsi="Calibri"/>
-                <w:b/>
-                <w:bCs/>
-                <w:color w:val="1F4E79" w:themeColor="accent1" w:themeShade="80"/>
+                <w:sz w:val="21"/>
               </w:rPr>
-            </w:pPr>
-          </w:p>
-          <w:p>
-            <w:pPr>
-              <w:jc w:val="both"/>
+              <w:br/>
+            </w:r>
+            <w:r>
               <w:rPr>
-                <w:rFonts w:ascii="Calibri" w:hAnsi="Calibri"/>
-                <w:b/>
-                <w:bCs/>
-                <w:color w:val="1F4E79" w:themeColor="accent1" w:themeShade="80"/>
+                <w:rFonts w:eastAsiaTheme="majorEastAsia"/>
+                <w:sz w:val="24"/>
+                <w:szCs w:val="24"/>
               </w:rPr>
-            </w:pPr>
-          </w:p>
-          <w:p>
-            <w:pPr>
-              <w:jc w:val="both"/>
+              <w:t xml:space="preserve">Las dificultades se han enfrentado priorizando primero los riesgos que podían afectar todo el proyecto y evitando una reingeniería general. En vez de continuar agregando funcionalidades sobre una base inestable, se trabajó por etapas pequeñas, con pruebas y regresión antes de integrar cambios. Para recuperar el avance, utilizaremos Kanban para visualizar pendientes, responsables y bloqueos; Miguel apoyará las pruebas y Jorge la documentación y coordinación con </w:t>
+            </w:r>
+            <w:proofErr w:type="spellStart"/>
+            <w:r>
               <w:rPr>
-                <w:rFonts w:ascii="Calibri" w:hAnsi="Calibri"/>
-                <w:b/>
-                <w:bCs/>
-                <w:color w:val="1F4E79" w:themeColor="accent1" w:themeShade="80"/>
+                <w:rFonts w:eastAsiaTheme="majorEastAsia"/>
+                <w:sz w:val="24"/>
+                <w:szCs w:val="24"/>
               </w:rPr>
-            </w:pPr>
+              <w:t>Alloxentric</w:t>
+            </w:r>
+            <w:proofErr w:type="spellEnd"/>
+            <w:r>
+              <w:rPr>
+                <w:rFonts w:eastAsiaTheme="majorEastAsia"/>
+                <w:sz w:val="24"/>
+                <w:szCs w:val="24"/>
+              </w:rPr>
+              <w:t xml:space="preserve">. La prioridad inmediata será retomar el incremento móvil/PWA, preparar el despliegue en </w:t>
+            </w:r>
+            <w:proofErr w:type="spellStart"/>
+            <w:r>
+              <w:rPr>
+                <w:rFonts w:eastAsiaTheme="majorEastAsia"/>
+                <w:sz w:val="24"/>
+                <w:szCs w:val="24"/>
+              </w:rPr>
+              <w:t>Vercel</w:t>
+            </w:r>
+            <w:proofErr w:type="spellEnd"/>
+            <w:r>
+              <w:rPr>
+                <w:rFonts w:eastAsiaTheme="majorEastAsia"/>
+                <w:sz w:val="24"/>
+                <w:szCs w:val="24"/>
+              </w:rPr>
+              <w:t xml:space="preserve"> y mantener en la planificación RAG offline, PDF y la integración final de auditoría.</w:t>
+            </w:r>
           </w:p>
         </w:tc>
       </w:tr>
@@ -512,102 +588,6 @@
           <w:sz w:val="24"/>
           <w:szCs w:val="24"/>
           <w:lang w:eastAsia="ja-JP"/>
-        </w:rPr>
-      </w:pPr>
-    </w:p>
-    <w:p>
-      <w:pPr>
-        <w:spacing w:after="0" w:line="360" w:lineRule="auto"/>
-        <w:jc w:val="both"/>
-        <w:rPr>
-          <w:b/>
-          <w:bCs/>
-          <w:sz w:val="24"/>
-          <w:szCs w:val="24"/>
-        </w:rPr>
-      </w:pPr>
-    </w:p>
-    <w:p>
-      <w:pPr>
-        <w:spacing w:after="0" w:line="360" w:lineRule="auto"/>
-        <w:jc w:val="both"/>
-        <w:rPr>
-          <w:b/>
-          <w:bCs/>
-          <w:sz w:val="24"/>
-          <w:szCs w:val="24"/>
-        </w:rPr>
-      </w:pPr>
-    </w:p>
-    <w:p>
-      <w:pPr>
-        <w:spacing w:after="0" w:line="360" w:lineRule="auto"/>
-        <w:jc w:val="both"/>
-        <w:rPr>
-          <w:b/>
-          <w:bCs/>
-          <w:sz w:val="24"/>
-          <w:szCs w:val="24"/>
-        </w:rPr>
-      </w:pPr>
-    </w:p>
-    <w:p>
-      <w:pPr>
-        <w:spacing w:after="0" w:line="360" w:lineRule="auto"/>
-        <w:jc w:val="both"/>
-        <w:rPr>
-          <w:b/>
-          <w:bCs/>
-          <w:sz w:val="24"/>
-          <w:szCs w:val="24"/>
-        </w:rPr>
-      </w:pPr>
-    </w:p>
-    <w:p>
-      <w:pPr>
-        <w:spacing w:after="0" w:line="360" w:lineRule="auto"/>
-        <w:jc w:val="both"/>
-        <w:rPr>
-          <w:b/>
-          <w:bCs/>
-          <w:sz w:val="24"/>
-          <w:szCs w:val="24"/>
-        </w:rPr>
-      </w:pPr>
-    </w:p>
-    <w:p>
-      <w:pPr>
-        <w:spacing w:after="0" w:line="360" w:lineRule="auto"/>
-        <w:jc w:val="both"/>
-        <w:rPr>
-          <w:b/>
-          <w:bCs/>
-          <w:sz w:val="24"/>
-          <w:szCs w:val="24"/>
-        </w:rPr>
-      </w:pPr>
-    </w:p>
-    <w:p>
-      <w:pPr>
-        <w:spacing w:after="0" w:line="360" w:lineRule="auto"/>
-        <w:jc w:val="both"/>
-        <w:rPr>
-          <w:b/>
-          <w:bCs/>
-          <w:sz w:val="24"/>
-          <w:szCs w:val="24"/>
-        </w:rPr>
-      </w:pPr>
-    </w:p>
-    <w:p>
-      <w:pPr>
-        <w:spacing w:after="0" w:line="360" w:lineRule="auto"/>
-        <w:jc w:val="both"/>
-        <w:rPr>
-          <w:b/>
-          <w:bCs/>
-          <w:sz w:val="24"/>
-          <w:szCs w:val="24"/>
         </w:rPr>
       </w:pPr>
     </w:p>
@@ -654,6 +634,7 @@
                 <w:sz w:val="24"/>
                 <w:szCs w:val="24"/>
               </w:rPr>
+              <w:lastRenderedPageBreak/>
               <w:t>3. Hasta el momento:</w:t>
             </w:r>
           </w:p>
@@ -685,7 +666,6 @@
                 <w:sz w:val="24"/>
                 <w:szCs w:val="24"/>
               </w:rPr>
-              <w:lastRenderedPageBreak/>
               <w:t>¿Cómo evalúas tu</w:t>
             </w:r>
             <w:r>
@@ -723,63 +703,35 @@
           </w:p>
           <w:p>
             <w:pPr>
+              <w:spacing w:before="120"/>
               <w:jc w:val="both"/>
+            </w:pPr>
+            <w:r>
               <w:rPr>
                 <w:rFonts w:ascii="Calibri" w:hAnsi="Calibri"/>
-                <w:b/>
-                <w:bCs/>
-                <w:color w:val="1F4E79" w:themeColor="accent1" w:themeShade="80"/>
+                <w:sz w:val="21"/>
               </w:rPr>
-            </w:pPr>
-          </w:p>
-          <w:p>
-            <w:pPr>
-              <w:jc w:val="both"/>
+              <w:t>Respuesta:</w:t>
+            </w:r>
+            <w:r>
               <w:rPr>
                 <w:rFonts w:ascii="Calibri" w:hAnsi="Calibri"/>
-                <w:b/>
-                <w:bCs/>
-                <w:color w:val="1F4E79" w:themeColor="accent1" w:themeShade="80"/>
+                <w:sz w:val="21"/>
               </w:rPr>
-            </w:pPr>
-          </w:p>
-          <w:p>
-            <w:pPr>
-              <w:jc w:val="both"/>
+              <w:br/>
+            </w:r>
+            <w:r>
               <w:rPr>
-                <w:rFonts w:ascii="Calibri" w:hAnsi="Calibri"/>
-                <w:b/>
-                <w:bCs/>
-                <w:color w:val="1F4E79" w:themeColor="accent1" w:themeShade="80"/>
+                <w:rFonts w:eastAsiaTheme="majorEastAsia"/>
+                <w:sz w:val="24"/>
+                <w:szCs w:val="24"/>
               </w:rPr>
-            </w:pPr>
-          </w:p>
-          <w:p>
-            <w:pPr>
-              <w:jc w:val="both"/>
-              <w:rPr>
-                <w:rFonts w:ascii="Calibri" w:hAnsi="Calibri"/>
-                <w:b/>
-                <w:bCs/>
-                <w:color w:val="1F4E79" w:themeColor="accent1" w:themeShade="80"/>
-              </w:rPr>
-            </w:pPr>
+              <w:t>Evalúo mi trabajo positivamente en la coordinación y en el control técnico del proyecto, especialmente porque pude ordenar una base que presentaba problemas y dejar trazabilidad de las decisiones, pruebas y cambios realizados. Mi experiencia en planificación, control de procesos, bases de datos y seguimiento de proyectos me ha ayudado a organizar el trabajo y analizar los riesgos antes de seguir desarrollando. Sin embargo, debo mejorar la distribución de tareas. Durante gran parte del avance asumí prácticamente todas las actividades, lo que no es sostenible para el cierre. También debo evitar dedicar demasiado tiempo a perfeccionar la base técnica cuando ya existe una condición suficiente para continuar con los requerimientos funcionales.</w:t>
+            </w:r>
           </w:p>
         </w:tc>
       </w:tr>
     </w:tbl>
-    <w:p>
-      <w:pPr>
-        <w:spacing w:after="0" w:line="360" w:lineRule="auto"/>
-        <w:jc w:val="both"/>
-        <w:rPr>
-          <w:color w:val="595959" w:themeColor="text1" w:themeTint="A6"/>
-          <w:sz w:val="24"/>
-          <w:szCs w:val="24"/>
-          <w:lang w:eastAsia="ja-JP"/>
-        </w:rPr>
-      </w:pPr>
-    </w:p>
     <w:p/>
     <w:tbl>
       <w:tblPr>
@@ -860,58 +812,30 @@
           </w:p>
           <w:p>
             <w:pPr>
-              <w:jc w:val="both"/>
+              <w:spacing w:before="120"/>
+            </w:pPr>
+            <w:r>
               <w:rPr>
                 <w:rFonts w:ascii="Calibri" w:hAnsi="Calibri"/>
-                <w:b/>
-                <w:bCs/>
-                <w:color w:val="1F4E79" w:themeColor="accent1" w:themeShade="80"/>
+                <w:sz w:val="21"/>
               </w:rPr>
-            </w:pPr>
-          </w:p>
-          <w:p>
-            <w:pPr>
-              <w:jc w:val="both"/>
+              <w:t>Respuesta:</w:t>
+            </w:r>
+            <w:r>
               <w:rPr>
                 <w:rFonts w:ascii="Calibri" w:hAnsi="Calibri"/>
-                <w:b/>
-                <w:bCs/>
-                <w:color w:val="1F4E79" w:themeColor="accent1" w:themeShade="80"/>
+                <w:sz w:val="21"/>
               </w:rPr>
-            </w:pPr>
-          </w:p>
-          <w:p>
-            <w:pPr>
-              <w:jc w:val="both"/>
+              <w:br/>
+            </w:r>
+            <w:r>
               <w:rPr>
-                <w:rFonts w:ascii="Calibri" w:hAnsi="Calibri"/>
-                <w:b/>
-                <w:bCs/>
-                <w:color w:val="1F4E79" w:themeColor="accent1" w:themeShade="80"/>
+                <w:rFonts w:eastAsiaTheme="majorEastAsia"/>
+                <w:sz w:val="24"/>
+                <w:szCs w:val="24"/>
               </w:rPr>
-            </w:pPr>
-          </w:p>
-          <w:p>
-            <w:pPr>
-              <w:jc w:val="both"/>
-              <w:rPr>
-                <w:rFonts w:ascii="Calibri" w:hAnsi="Calibri"/>
-                <w:b/>
-                <w:bCs/>
-                <w:color w:val="1F4E79" w:themeColor="accent1" w:themeShade="80"/>
-              </w:rPr>
-            </w:pPr>
-          </w:p>
-          <w:p>
-            <w:pPr>
-              <w:jc w:val="both"/>
-              <w:rPr>
-                <w:rFonts w:ascii="Calibri" w:hAnsi="Calibri"/>
-                <w:b/>
-                <w:bCs/>
-                <w:color w:val="1F4E79" w:themeColor="accent1" w:themeShade="80"/>
-              </w:rPr>
-            </w:pPr>
+              <w:t>Mi principal inquietud es cómo equilibrar el cumplimiento de la planificación original con los ajustes técnicos que fueron necesarios y que están respaldados por evidencia. Me gustaría confirmar con el docente si la estabilización P0.1–P0.7 puede presentarse formalmente como un ajuste justificado del plan de trabajo, manteniendo los cuatro requerimientos oficiales sin alterar el objetivo único del proyecto. También quisiera validar el nivel de profundidad esperado para documentar las pruebas ya ejecutadas frente a las que todavía quedan planificadas para PWA, RAG offline, PDF e integración.</w:t>
+            </w:r>
           </w:p>
         </w:tc>
       </w:tr>
@@ -925,18 +849,6 @@
           <w:sz w:val="24"/>
           <w:szCs w:val="24"/>
           <w:lang w:eastAsia="ja-JP"/>
-        </w:rPr>
-      </w:pPr>
-    </w:p>
-    <w:p>
-      <w:pPr>
-        <w:spacing w:after="0" w:line="360" w:lineRule="auto"/>
-        <w:jc w:val="both"/>
-        <w:rPr>
-          <w:b/>
-          <w:bCs/>
-          <w:sz w:val="24"/>
-          <w:szCs w:val="24"/>
         </w:rPr>
       </w:pPr>
     </w:p>
@@ -1019,51 +931,95 @@
           </w:p>
           <w:p>
             <w:pPr>
+              <w:spacing w:before="120"/>
               <w:jc w:val="both"/>
+            </w:pPr>
+            <w:r>
+              <w:rPr>
+                <w:rFonts w:ascii="Calibri" w:hAnsi="Calibri"/>
+                <w:sz w:val="21"/>
+              </w:rPr>
+              <w:t>Respuesta:</w:t>
+            </w:r>
+            <w:r>
+              <w:rPr>
+                <w:rFonts w:ascii="Calibri" w:hAnsi="Calibri"/>
+                <w:sz w:val="21"/>
+              </w:rPr>
+              <w:br/>
+            </w:r>
+            <w:r>
               <w:rPr>
                 <w:rFonts w:eastAsiaTheme="majorEastAsia"/>
-                <w:color w:val="767171" w:themeColor="background2" w:themeShade="80"/>
                 <w:sz w:val="24"/>
                 <w:szCs w:val="24"/>
               </w:rPr>
-            </w:pPr>
-          </w:p>
-          <w:p>
-            <w:pPr>
-              <w:jc w:val="both"/>
+              <w:t xml:space="preserve">Sí. A partir del monitoreo consideramos necesario redistribuir actividades. Luis continuará coordinando el proyecto y los desarrollos que actualmente concentran mayor contexto técnico. Miguel, que recientemente logró levantar el entorno, asumirá tareas de pruebas y validación para generar evidencia independiente de los incrementos. Jorge, que recién se incorpora a funciones del proyecto, apoyará la documentación y la integración/coordinación con </w:t>
+            </w:r>
+            <w:proofErr w:type="spellStart"/>
+            <w:r>
               <w:rPr>
                 <w:rFonts w:eastAsiaTheme="majorEastAsia"/>
-                <w:color w:val="767171" w:themeColor="background2" w:themeShade="80"/>
                 <w:sz w:val="24"/>
                 <w:szCs w:val="24"/>
               </w:rPr>
-            </w:pPr>
-          </w:p>
-          <w:p>
-            <w:pPr>
-              <w:jc w:val="both"/>
+              <w:t>Alloxentric</w:t>
+            </w:r>
+            <w:proofErr w:type="spellEnd"/>
+            <w:r>
               <w:rPr>
                 <w:rFonts w:eastAsiaTheme="majorEastAsia"/>
-                <w:color w:val="767171" w:themeColor="background2" w:themeShade="80"/>
                 <w:sz w:val="24"/>
                 <w:szCs w:val="24"/>
               </w:rPr>
-            </w:pPr>
-          </w:p>
-          <w:p>
-            <w:pPr>
-              <w:jc w:val="both"/>
+              <w:t xml:space="preserve">. La redistribución se irá reflejando en Kanban y en </w:t>
+            </w:r>
+            <w:proofErr w:type="spellStart"/>
+            <w:r>
               <w:rPr>
-                <w:rFonts w:ascii="Calibri" w:hAnsi="Calibri"/>
-                <w:b/>
-                <w:bCs/>
-                <w:color w:val="1F4E79" w:themeColor="accent1" w:themeShade="80"/>
+                <w:rFonts w:eastAsiaTheme="majorEastAsia"/>
+                <w:sz w:val="24"/>
+                <w:szCs w:val="24"/>
               </w:rPr>
-            </w:pPr>
+              <w:t>CoreStream</w:t>
+            </w:r>
+            <w:proofErr w:type="spellEnd"/>
+            <w:r>
+              <w:rPr>
+                <w:rFonts w:eastAsiaTheme="majorEastAsia"/>
+                <w:sz w:val="24"/>
+                <w:szCs w:val="24"/>
+              </w:rPr>
+              <w:t xml:space="preserve"> para que cada actividad tenga responsable y evidencia verificable.</w:t>
+            </w:r>
           </w:p>
         </w:tc>
       </w:tr>
     </w:tbl>
+    <w:p>
+      <w:pPr>
+        <w:spacing w:after="0" w:line="360" w:lineRule="auto"/>
+        <w:jc w:val="both"/>
+        <w:rPr>
+          <w:color w:val="595959" w:themeColor="text1" w:themeTint="A6"/>
+          <w:sz w:val="24"/>
+          <w:szCs w:val="24"/>
+          <w:lang w:eastAsia="ja-JP"/>
+        </w:rPr>
+      </w:pPr>
+    </w:p>
+    <w:p>
+      <w:pPr>
+        <w:spacing w:after="0" w:line="360" w:lineRule="auto"/>
+        <w:jc w:val="both"/>
+        <w:rPr>
+          <w:color w:val="595959" w:themeColor="text1" w:themeTint="A6"/>
+          <w:sz w:val="24"/>
+          <w:szCs w:val="24"/>
+          <w:lang w:eastAsia="ja-JP"/>
+        </w:rPr>
+      </w:pPr>
+    </w:p>
     <w:p>
       <w:pPr>
         <w:spacing w:after="0" w:line="360" w:lineRule="auto"/>
@@ -1131,6 +1087,7 @@
                 <w:sz w:val="24"/>
                 <w:szCs w:val="24"/>
               </w:rPr>
+              <w:lastRenderedPageBreak/>
               <w:t>6</w:t>
             </w:r>
             <w:r>
@@ -1141,8 +1098,6 @@
               </w:rPr>
               <w:t>. APT  grupal</w:t>
             </w:r>
-            <w:bookmarkStart w:id="0" w:name="_GoBack"/>
-            <w:bookmarkEnd w:id="0"/>
           </w:p>
         </w:tc>
       </w:tr>
@@ -1177,58 +1132,46 @@
           </w:p>
           <w:p>
             <w:pPr>
-              <w:jc w:val="both"/>
+              <w:spacing w:before="120"/>
+            </w:pPr>
+            <w:r>
+              <w:rPr>
+                <w:rFonts w:ascii="Calibri" w:hAnsi="Calibri"/>
+                <w:sz w:val="21"/>
+              </w:rPr>
+              <w:t>Respuesta:</w:t>
+            </w:r>
+            <w:r>
+              <w:rPr>
+                <w:rFonts w:ascii="Calibri" w:hAnsi="Calibri"/>
+                <w:sz w:val="21"/>
+              </w:rPr>
+              <w:br/>
+            </w:r>
+            <w:r>
               <w:rPr>
                 <w:rFonts w:eastAsiaTheme="majorEastAsia"/>
-                <w:color w:val="767171" w:themeColor="background2" w:themeShade="80"/>
                 <w:sz w:val="24"/>
                 <w:szCs w:val="24"/>
               </w:rPr>
-            </w:pPr>
-          </w:p>
-          <w:p>
-            <w:pPr>
-              <w:jc w:val="both"/>
+              <w:t xml:space="preserve">Como equipo valoramos que se ha mantenido la continuidad del proyecto pese a las dificultades técnicas y que actualmente existe una base más estable y documentada que al inicio. Destacamos la disposición para incorporarse al trabajo y la posibilidad de distribuir mejor las actividades desde esta etapa. </w:t>
+            </w:r>
+            <w:r>
               <w:rPr>
                 <w:rFonts w:eastAsiaTheme="majorEastAsia"/>
-                <w:color w:val="767171" w:themeColor="background2" w:themeShade="80"/>
                 <w:sz w:val="24"/>
                 <w:szCs w:val="24"/>
               </w:rPr>
-            </w:pPr>
-          </w:p>
-          <w:p>
-            <w:pPr>
-              <w:jc w:val="both"/>
+              <w:t>El principal aspecto para mejorar</w:t>
+            </w:r>
+            <w:r>
               <w:rPr>
                 <w:rFonts w:eastAsiaTheme="majorEastAsia"/>
-                <w:color w:val="767171" w:themeColor="background2" w:themeShade="80"/>
                 <w:sz w:val="24"/>
                 <w:szCs w:val="24"/>
               </w:rPr>
-            </w:pPr>
-          </w:p>
-          <w:p>
-            <w:pPr>
-              <w:jc w:val="both"/>
-              <w:rPr>
-                <w:rFonts w:eastAsiaTheme="majorEastAsia"/>
-                <w:color w:val="767171" w:themeColor="background2" w:themeShade="80"/>
-                <w:sz w:val="24"/>
-                <w:szCs w:val="24"/>
-              </w:rPr>
-            </w:pPr>
-          </w:p>
-          <w:p>
-            <w:pPr>
-              <w:jc w:val="both"/>
-              <w:rPr>
-                <w:rFonts w:ascii="Calibri" w:hAnsi="Calibri"/>
-                <w:b/>
-                <w:bCs/>
-                <w:color w:val="1F4E79" w:themeColor="accent1" w:themeShade="80"/>
-              </w:rPr>
-            </w:pPr>
+              <w:t xml:space="preserve"> es la participación equilibrada y anticipada: hasta ahora gran parte del avance técnico y de coordinación se concentró en Luis. Para el cierre necesitamos que las pruebas, la documentación y la relación con la contraparte tengan responsables claros, evidencia en el repositorio y seguimiento periódico mediante Kanban.</w:t>
+            </w:r>
           </w:p>
         </w:tc>
       </w:tr>
@@ -1272,7 +1215,7 @@
 </file>
 
 <file path=word/endnotes.xml><?xml version="1.0" encoding="utf-8"?>
-<w:endnotes xmlns:wpc="http://schemas.microsoft.com/office/word/2010/wordprocessingCanvas" xmlns:cx="http://schemas.microsoft.com/office/drawing/2014/chartex" xmlns:mc="http://schemas.openxmlformats.org/markup-compatibility/2006" xmlns:o="urn:schemas-microsoft-com:office:office" xmlns:r="http://schemas.openxmlformats.org/officeDocument/2006/relationships" xmlns:m="http://schemas.openxmlformats.org/officeDocument/2006/math" xmlns:v="urn:schemas-microsoft-com:vml" xmlns:wp14="http://schemas.microsoft.com/office/word/2010/wordprocessingDrawing" xmlns:wp="http://schemas.openxmlformats.org/drawingml/2006/wordprocessingDrawing" xmlns:w10="urn:schemas-microsoft-com:office:word" xmlns:w="http://schemas.openxmlformats.org/wordprocessingml/2006/main" xmlns:w14="http://schemas.microsoft.com/office/word/2010/wordml" xmlns:w15="http://schemas.microsoft.com/office/word/2012/wordml" xmlns:w16se="http://schemas.microsoft.com/office/word/2015/wordml/symex" xmlns:wpg="http://schemas.microsoft.com/office/word/2010/wordprocessingGroup" xmlns:wpi="http://schemas.microsoft.com/office/word/2010/wordprocessingInk" xmlns:wne="http://schemas.microsoft.com/office/word/2006/wordml" xmlns:wps="http://schemas.microsoft.com/office/word/2010/wordprocessingShape" mc:Ignorable="w14 w15 w16se wp14">
+<w:endnotes xmlns:wpc="http://schemas.microsoft.com/office/word/2010/wordprocessingCanvas" xmlns:cx="http://schemas.microsoft.com/office/drawing/2014/chartex" xmlns:cx1="http://schemas.microsoft.com/office/drawing/2015/9/8/chartex" xmlns:cx2="http://schemas.microsoft.com/office/drawing/2015/10/21/chartex" xmlns:cx3="http://schemas.microsoft.com/office/drawing/2016/5/9/chartex" xmlns:cx4="http://schemas.microsoft.com/office/drawing/2016/5/10/chartex" xmlns:cx5="http://schemas.microsoft.com/office/drawing/2016/5/11/chartex" xmlns:cx6="http://schemas.microsoft.com/office/drawing/2016/5/12/chartex" xmlns:cx7="http://schemas.microsoft.com/office/drawing/2016/5/13/chartex" xmlns:cx8="http://schemas.microsoft.com/office/drawing/2016/5/14/chartex" xmlns:mc="http://schemas.openxmlformats.org/markup-compatibility/2006" xmlns:aink="http://schemas.microsoft.com/office/drawing/2016/ink" xmlns:am3d="http://schemas.microsoft.com/office/drawing/2017/model3d" xmlns:o="urn:schemas-microsoft-com:office:office" xmlns:oel="http://schemas.microsoft.com/office/2019/extlst" xmlns:r="http://schemas.openxmlformats.org/officeDocument/2006/relationships" xmlns:m="http://schemas.openxmlformats.org/officeDocument/2006/math" xmlns:v="urn:schemas-microsoft-com:vml" xmlns:wp14="http://schemas.microsoft.com/office/word/2010/wordprocessingDrawing" xmlns:wp="http://schemas.openxmlformats.org/drawingml/2006/wordprocessingDrawing" xmlns:w10="urn:schemas-microsoft-com:office:word" xmlns:w="http://schemas.openxmlformats.org/wordprocessingml/2006/main" xmlns:w14="http://schemas.microsoft.com/office/word/2010/wordml" xmlns:w15="http://schemas.microsoft.com/office/word/2012/wordml" xmlns:w16cex="http://schemas.microsoft.com/office/word/2018/wordml/cex" xmlns:w16cid="http://schemas.microsoft.com/office/word/2016/wordml/cid" xmlns:w16="http://schemas.microsoft.com/office/word/2018/wordml" xmlns:w16du="http://schemas.microsoft.com/office/word/2023/wordml/word16du" xmlns:w16sdtdh="http://schemas.microsoft.com/office/word/2020/wordml/sdtdatahash" xmlns:w16sdtfl="http://schemas.microsoft.com/office/word/2024/wordml/sdtformatlock" xmlns:w16se="http://schemas.microsoft.com/office/word/2015/wordml/symex" xmlns:wpg="http://schemas.microsoft.com/office/word/2010/wordprocessingGroup" xmlns:wpi="http://schemas.microsoft.com/office/word/2010/wordprocessingInk" xmlns:wne="http://schemas.microsoft.com/office/word/2006/wordml" xmlns:wps="http://schemas.microsoft.com/office/word/2010/wordprocessingShape" mc:Ignorable="w14 w15 w16se w16cid w16 w16cex w16sdtdh w16sdtfl w16du wp14">
   <w:endnote w:type="separator" w:id="-1">
     <w:p>
       <w:pPr>
@@ -1297,7 +1240,7 @@
 </file>
 
 <file path=word/footer1.xml><?xml version="1.0" encoding="utf-8"?>
-<w:ftr xmlns:wpc="http://schemas.microsoft.com/office/word/2010/wordprocessingCanvas" xmlns:cx="http://schemas.microsoft.com/office/drawing/2014/chartex" xmlns:mc="http://schemas.openxmlformats.org/markup-compatibility/2006" xmlns:o="urn:schemas-microsoft-com:office:office" xmlns:r="http://schemas.openxmlformats.org/officeDocument/2006/relationships" xmlns:m="http://schemas.openxmlformats.org/officeDocument/2006/math" xmlns:v="urn:schemas-microsoft-com:vml" xmlns:wp14="http://schemas.microsoft.com/office/word/2010/wordprocessingDrawing" xmlns:wp="http://schemas.openxmlformats.org/drawingml/2006/wordprocessingDrawing" xmlns:w10="urn:schemas-microsoft-com:office:word" xmlns:w="http://schemas.openxmlformats.org/wordprocessingml/2006/main" xmlns:w14="http://schemas.microsoft.com/office/word/2010/wordml" xmlns:w15="http://schemas.microsoft.com/office/word/2012/wordml" xmlns:w16se="http://schemas.microsoft.com/office/word/2015/wordml/symex" xmlns:wpg="http://schemas.microsoft.com/office/word/2010/wordprocessingGroup" xmlns:wpi="http://schemas.microsoft.com/office/word/2010/wordprocessingInk" xmlns:wne="http://schemas.microsoft.com/office/word/2006/wordml" xmlns:wps="http://schemas.microsoft.com/office/word/2010/wordprocessingShape" mc:Ignorable="w14 w15 w16se wp14">
+<w:ftr xmlns:wpc="http://schemas.microsoft.com/office/word/2010/wordprocessingCanvas" xmlns:cx="http://schemas.microsoft.com/office/drawing/2014/chartex" xmlns:cx1="http://schemas.microsoft.com/office/drawing/2015/9/8/chartex" xmlns:cx2="http://schemas.microsoft.com/office/drawing/2015/10/21/chartex" xmlns:cx3="http://schemas.microsoft.com/office/drawing/2016/5/9/chartex" xmlns:cx4="http://schemas.microsoft.com/office/drawing/2016/5/10/chartex" xmlns:cx5="http://schemas.microsoft.com/office/drawing/2016/5/11/chartex" xmlns:cx6="http://schemas.microsoft.com/office/drawing/2016/5/12/chartex" xmlns:cx7="http://schemas.microsoft.com/office/drawing/2016/5/13/chartex" xmlns:cx8="http://schemas.microsoft.com/office/drawing/2016/5/14/chartex" xmlns:mc="http://schemas.openxmlformats.org/markup-compatibility/2006" xmlns:aink="http://schemas.microsoft.com/office/drawing/2016/ink" xmlns:am3d="http://schemas.microsoft.com/office/drawing/2017/model3d" xmlns:o="urn:schemas-microsoft-com:office:office" xmlns:oel="http://schemas.microsoft.com/office/2019/extlst" xmlns:r="http://schemas.openxmlformats.org/officeDocument/2006/relationships" xmlns:m="http://schemas.openxmlformats.org/officeDocument/2006/math" xmlns:v="urn:schemas-microsoft-com:vml" xmlns:wp14="http://schemas.microsoft.com/office/word/2010/wordprocessingDrawing" xmlns:wp="http://schemas.openxmlformats.org/drawingml/2006/wordprocessingDrawing" xmlns:w10="urn:schemas-microsoft-com:office:word" xmlns:w="http://schemas.openxmlformats.org/wordprocessingml/2006/main" xmlns:w14="http://schemas.microsoft.com/office/word/2010/wordml" xmlns:w15="http://schemas.microsoft.com/office/word/2012/wordml" xmlns:w16cex="http://schemas.microsoft.com/office/word/2018/wordml/cex" xmlns:w16cid="http://schemas.microsoft.com/office/word/2016/wordml/cid" xmlns:w16="http://schemas.microsoft.com/office/word/2018/wordml" xmlns:w16du="http://schemas.microsoft.com/office/word/2023/wordml/word16du" xmlns:w16sdtdh="http://schemas.microsoft.com/office/word/2020/wordml/sdtdatahash" xmlns:w16sdtfl="http://schemas.microsoft.com/office/word/2024/wordml/sdtformatlock" xmlns:w16se="http://schemas.microsoft.com/office/word/2015/wordml/symex" xmlns:wpg="http://schemas.microsoft.com/office/word/2010/wordprocessingGroup" xmlns:wpi="http://schemas.microsoft.com/office/word/2010/wordprocessingInk" xmlns:wne="http://schemas.microsoft.com/office/word/2006/wordml" xmlns:wps="http://schemas.microsoft.com/office/word/2010/wordprocessingShape" mc:Ignorable="w14 w15 w16se w16cid w16 w16cex w16sdtdh w16sdtfl w16du wp14">
   <w:sdt>
     <w:sdtPr>
       <w:id w:val="-937982979"/>
@@ -1306,7 +1249,6 @@
         <w:docPartUnique/>
       </w:docPartObj>
     </w:sdtPr>
-    <w:sdtEndPr/>
     <w:sdtContent>
       <w:p>
         <w:pPr>
@@ -1585,7 +1527,7 @@
 </file>
 
 <file path=word/footnotes.xml><?xml version="1.0" encoding="utf-8"?>
-<w:footnotes xmlns:wpc="http://schemas.microsoft.com/office/word/2010/wordprocessingCanvas" xmlns:cx="http://schemas.microsoft.com/office/drawing/2014/chartex" xmlns:mc="http://schemas.openxmlformats.org/markup-compatibility/2006" xmlns:o="urn:schemas-microsoft-com:office:office" xmlns:r="http://schemas.openxmlformats.org/officeDocument/2006/relationships" xmlns:m="http://schemas.openxmlformats.org/officeDocument/2006/math" xmlns:v="urn:schemas-microsoft-com:vml" xmlns:wp14="http://schemas.microsoft.com/office/word/2010/wordprocessingDrawing" xmlns:wp="http://schemas.openxmlformats.org/drawingml/2006/wordprocessingDrawing" xmlns:w10="urn:schemas-microsoft-com:office:word" xmlns:w="http://schemas.openxmlformats.org/wordprocessingml/2006/main" xmlns:w14="http://schemas.microsoft.com/office/word/2010/wordml" xmlns:w15="http://schemas.microsoft.com/office/word/2012/wordml" xmlns:w16se="http://schemas.microsoft.com/office/word/2015/wordml/symex" xmlns:wpg="http://schemas.microsoft.com/office/word/2010/wordprocessingGroup" xmlns:wpi="http://schemas.microsoft.com/office/word/2010/wordprocessingInk" xmlns:wne="http://schemas.microsoft.com/office/word/2006/wordml" xmlns:wps="http://schemas.microsoft.com/office/word/2010/wordprocessingShape" mc:Ignorable="w14 w15 w16se wp14">
+<w:footnotes xmlns:wpc="http://schemas.microsoft.com/office/word/2010/wordprocessingCanvas" xmlns:cx="http://schemas.microsoft.com/office/drawing/2014/chartex" xmlns:cx1="http://schemas.microsoft.com/office/drawing/2015/9/8/chartex" xmlns:cx2="http://schemas.microsoft.com/office/drawing/2015/10/21/chartex" xmlns:cx3="http://schemas.microsoft.com/office/drawing/2016/5/9/chartex" xmlns:cx4="http://schemas.microsoft.com/office/drawing/2016/5/10/chartex" xmlns:cx5="http://schemas.microsoft.com/office/drawing/2016/5/11/chartex" xmlns:cx6="http://schemas.microsoft.com/office/drawing/2016/5/12/chartex" xmlns:cx7="http://schemas.microsoft.com/office/drawing/2016/5/13/chartex" xmlns:cx8="http://schemas.microsoft.com/office/drawing/2016/5/14/chartex" xmlns:mc="http://schemas.openxmlformats.org/markup-compatibility/2006" xmlns:aink="http://schemas.microsoft.com/office/drawing/2016/ink" xmlns:am3d="http://schemas.microsoft.com/office/drawing/2017/model3d" xmlns:o="urn:schemas-microsoft-com:office:office" xmlns:oel="http://schemas.microsoft.com/office/2019/extlst" xmlns:r="http://schemas.openxmlformats.org/officeDocument/2006/relationships" xmlns:m="http://schemas.openxmlformats.org/officeDocument/2006/math" xmlns:v="urn:schemas-microsoft-com:vml" xmlns:wp14="http://schemas.microsoft.com/office/word/2010/wordprocessingDrawing" xmlns:wp="http://schemas.openxmlformats.org/drawingml/2006/wordprocessingDrawing" xmlns:w10="urn:schemas-microsoft-com:office:word" xmlns:w="http://schemas.openxmlformats.org/wordprocessingml/2006/main" xmlns:w14="http://schemas.microsoft.com/office/word/2010/wordml" xmlns:w15="http://schemas.microsoft.com/office/word/2012/wordml" xmlns:w16cex="http://schemas.microsoft.com/office/word/2018/wordml/cex" xmlns:w16cid="http://schemas.microsoft.com/office/word/2016/wordml/cid" xmlns:w16="http://schemas.microsoft.com/office/word/2018/wordml" xmlns:w16du="http://schemas.microsoft.com/office/word/2023/wordml/word16du" xmlns:w16sdtdh="http://schemas.microsoft.com/office/word/2020/wordml/sdtdatahash" xmlns:w16sdtfl="http://schemas.microsoft.com/office/word/2024/wordml/sdtformatlock" xmlns:w16se="http://schemas.microsoft.com/office/word/2015/wordml/symex" xmlns:wpg="http://schemas.microsoft.com/office/word/2010/wordprocessingGroup" xmlns:wpi="http://schemas.microsoft.com/office/word/2010/wordprocessingInk" xmlns:wne="http://schemas.microsoft.com/office/word/2006/wordml" xmlns:wps="http://schemas.microsoft.com/office/word/2010/wordprocessingShape" mc:Ignorable="w14 w15 w16se w16cid w16 w16cex w16sdtdh w16sdtfl w16du wp14">
   <w:footnote w:type="separator" w:id="-1">
     <w:p>
       <w:pPr>
@@ -1610,7 +1552,7 @@
 </file>
 
 <file path=word/header1.xml><?xml version="1.0" encoding="utf-8"?>
-<w:hdr xmlns:wpc="http://schemas.microsoft.com/office/word/2010/wordprocessingCanvas" xmlns:cx="http://schemas.microsoft.com/office/drawing/2014/chartex" xmlns:mc="http://schemas.openxmlformats.org/markup-compatibility/2006" xmlns:o="urn:schemas-microsoft-com:office:office" xmlns:r="http://schemas.openxmlformats.org/officeDocument/2006/relationships" xmlns:m="http://schemas.openxmlformats.org/officeDocument/2006/math" xmlns:v="urn:schemas-microsoft-com:vml" xmlns:wp14="http://schemas.microsoft.com/office/word/2010/wordprocessingDrawing" xmlns:wp="http://schemas.openxmlformats.org/drawingml/2006/wordprocessingDrawing" xmlns:w10="urn:schemas-microsoft-com:office:word" xmlns:w="http://schemas.openxmlformats.org/wordprocessingml/2006/main" xmlns:w14="http://schemas.microsoft.com/office/word/2010/wordml" xmlns:w15="http://schemas.microsoft.com/office/word/2012/wordml" xmlns:w16se="http://schemas.microsoft.com/office/word/2015/wordml/symex" xmlns:wpg="http://schemas.microsoft.com/office/word/2010/wordprocessingGroup" xmlns:wpi="http://schemas.microsoft.com/office/word/2010/wordprocessingInk" xmlns:wne="http://schemas.microsoft.com/office/word/2006/wordml" xmlns:wps="http://schemas.microsoft.com/office/word/2010/wordprocessingShape" mc:Ignorable="w14 w15 w16se wp14">
+<w:hdr xmlns:wpc="http://schemas.microsoft.com/office/word/2010/wordprocessingCanvas" xmlns:cx="http://schemas.microsoft.com/office/drawing/2014/chartex" xmlns:cx1="http://schemas.microsoft.com/office/drawing/2015/9/8/chartex" xmlns:cx2="http://schemas.microsoft.com/office/drawing/2015/10/21/chartex" xmlns:cx3="http://schemas.microsoft.com/office/drawing/2016/5/9/chartex" xmlns:cx4="http://schemas.microsoft.com/office/drawing/2016/5/10/chartex" xmlns:cx5="http://schemas.microsoft.com/office/drawing/2016/5/11/chartex" xmlns:cx6="http://schemas.microsoft.com/office/drawing/2016/5/12/chartex" xmlns:cx7="http://schemas.microsoft.com/office/drawing/2016/5/13/chartex" xmlns:cx8="http://schemas.microsoft.com/office/drawing/2016/5/14/chartex" xmlns:mc="http://schemas.openxmlformats.org/markup-compatibility/2006" xmlns:aink="http://schemas.microsoft.com/office/drawing/2016/ink" xmlns:am3d="http://schemas.microsoft.com/office/drawing/2017/model3d" xmlns:o="urn:schemas-microsoft-com:office:office" xmlns:oel="http://schemas.microsoft.com/office/2019/extlst" xmlns:r="http://schemas.openxmlformats.org/officeDocument/2006/relationships" xmlns:m="http://schemas.openxmlformats.org/officeDocument/2006/math" xmlns:v="urn:schemas-microsoft-com:vml" xmlns:wp14="http://schemas.microsoft.com/office/word/2010/wordprocessingDrawing" xmlns:wp="http://schemas.openxmlformats.org/drawingml/2006/wordprocessingDrawing" xmlns:w10="urn:schemas-microsoft-com:office:word" xmlns:w="http://schemas.openxmlformats.org/wordprocessingml/2006/main" xmlns:w14="http://schemas.microsoft.com/office/word/2010/wordml" xmlns:w15="http://schemas.microsoft.com/office/word/2012/wordml" xmlns:w16cex="http://schemas.microsoft.com/office/word/2018/wordml/cex" xmlns:w16cid="http://schemas.microsoft.com/office/word/2016/wordml/cid" xmlns:w16="http://schemas.microsoft.com/office/word/2018/wordml" xmlns:w16du="http://schemas.microsoft.com/office/word/2023/wordml/word16du" xmlns:w16sdtdh="http://schemas.microsoft.com/office/word/2020/wordml/sdtdatahash" xmlns:w16sdtfl="http://schemas.microsoft.com/office/word/2024/wordml/sdtformatlock" xmlns:w16se="http://schemas.microsoft.com/office/word/2015/wordml/symex" xmlns:wpg="http://schemas.microsoft.com/office/word/2010/wordprocessingGroup" xmlns:wpi="http://schemas.microsoft.com/office/word/2010/wordprocessingInk" xmlns:wne="http://schemas.microsoft.com/office/word/2006/wordml" xmlns:wps="http://schemas.microsoft.com/office/word/2010/wordprocessingShape" mc:Ignorable="w14 w15 w16se w16cid w16 w16cex w16sdtdh w16sdtfl w16du wp14">
   <w:tbl>
     <w:tblPr>
       <w:tblStyle w:val="Tablaconcuadrcula"/>
@@ -1790,7 +1732,7 @@
 </file>
 
 <file path=word/header2.xml><?xml version="1.0" encoding="utf-8"?>
-<w:hdr xmlns:wpc="http://schemas.microsoft.com/office/word/2010/wordprocessingCanvas" xmlns:cx="http://schemas.microsoft.com/office/drawing/2014/chartex" xmlns:mc="http://schemas.openxmlformats.org/markup-compatibility/2006" xmlns:o="urn:schemas-microsoft-com:office:office" xmlns:r="http://schemas.openxmlformats.org/officeDocument/2006/relationships" xmlns:m="http://schemas.openxmlformats.org/officeDocument/2006/math" xmlns:v="urn:schemas-microsoft-com:vml" xmlns:wp14="http://schemas.microsoft.com/office/word/2010/wordprocessingDrawing" xmlns:wp="http://schemas.openxmlformats.org/drawingml/2006/wordprocessingDrawing" xmlns:w10="urn:schemas-microsoft-com:office:word" xmlns:w="http://schemas.openxmlformats.org/wordprocessingml/2006/main" xmlns:w14="http://schemas.microsoft.com/office/word/2010/wordml" xmlns:w15="http://schemas.microsoft.com/office/word/2012/wordml" xmlns:w16se="http://schemas.microsoft.com/office/word/2015/wordml/symex" xmlns:wpg="http://schemas.microsoft.com/office/word/2010/wordprocessingGroup" xmlns:wpi="http://schemas.microsoft.com/office/word/2010/wordprocessingInk" xmlns:wne="http://schemas.microsoft.com/office/word/2006/wordml" xmlns:wps="http://schemas.microsoft.com/office/word/2010/wordprocessingShape" mc:Ignorable="w14 w15 w16se wp14">
+<w:hdr xmlns:wpc="http://schemas.microsoft.com/office/word/2010/wordprocessingCanvas" xmlns:cx="http://schemas.microsoft.com/office/drawing/2014/chartex" xmlns:cx1="http://schemas.microsoft.com/office/drawing/2015/9/8/chartex" xmlns:cx2="http://schemas.microsoft.com/office/drawing/2015/10/21/chartex" xmlns:cx3="http://schemas.microsoft.com/office/drawing/2016/5/9/chartex" xmlns:cx4="http://schemas.microsoft.com/office/drawing/2016/5/10/chartex" xmlns:cx5="http://schemas.microsoft.com/office/drawing/2016/5/11/chartex" xmlns:cx6="http://schemas.microsoft.com/office/drawing/2016/5/12/chartex" xmlns:cx7="http://schemas.microsoft.com/office/drawing/2016/5/13/chartex" xmlns:cx8="http://schemas.microsoft.com/office/drawing/2016/5/14/chartex" xmlns:mc="http://schemas.openxmlformats.org/markup-compatibility/2006" xmlns:aink="http://schemas.microsoft.com/office/drawing/2016/ink" xmlns:am3d="http://schemas.microsoft.com/office/drawing/2017/model3d" xmlns:o="urn:schemas-microsoft-com:office:office" xmlns:oel="http://schemas.microsoft.com/office/2019/extlst" xmlns:r="http://schemas.openxmlformats.org/officeDocument/2006/relationships" xmlns:m="http://schemas.openxmlformats.org/officeDocument/2006/math" xmlns:v="urn:schemas-microsoft-com:vml" xmlns:wp14="http://schemas.microsoft.com/office/word/2010/wordprocessingDrawing" xmlns:wp="http://schemas.openxmlformats.org/drawingml/2006/wordprocessingDrawing" xmlns:w10="urn:schemas-microsoft-com:office:word" xmlns:w="http://schemas.openxmlformats.org/wordprocessingml/2006/main" xmlns:w14="http://schemas.microsoft.com/office/word/2010/wordml" xmlns:w15="http://schemas.microsoft.com/office/word/2012/wordml" xmlns:w16cex="http://schemas.microsoft.com/office/word/2018/wordml/cex" xmlns:w16cid="http://schemas.microsoft.com/office/word/2016/wordml/cid" xmlns:w16="http://schemas.microsoft.com/office/word/2018/wordml" xmlns:w16du="http://schemas.microsoft.com/office/word/2023/wordml/word16du" xmlns:w16sdtdh="http://schemas.microsoft.com/office/word/2020/wordml/sdtdatahash" xmlns:w16sdtfl="http://schemas.microsoft.com/office/word/2024/wordml/sdtformatlock" xmlns:w16se="http://schemas.microsoft.com/office/word/2015/wordml/symex" xmlns:wpg="http://schemas.microsoft.com/office/word/2010/wordprocessingGroup" xmlns:wpi="http://schemas.microsoft.com/office/word/2010/wordprocessingInk" xmlns:wne="http://schemas.microsoft.com/office/word/2006/wordml" xmlns:wps="http://schemas.microsoft.com/office/word/2010/wordprocessingShape" mc:Ignorable="w14 w15 w16se w16cid w16 w16cex w16sdtdh w16sdtfl w16du wp14">
   <w:tbl>
     <w:tblPr>
       <w:tblStyle w:val="Tablaconcuadrcula"/>
@@ -2065,7 +2007,7 @@
 </file>
 
 <file path=word/numbering.xml><?xml version="1.0" encoding="utf-8"?>
-<w:numbering xmlns:wpc="http://schemas.microsoft.com/office/word/2010/wordprocessingCanvas" xmlns:cx="http://schemas.microsoft.com/office/drawing/2014/chartex" xmlns:mc="http://schemas.openxmlformats.org/markup-compatibility/2006" xmlns:o="urn:schemas-microsoft-com:office:office" xmlns:r="http://schemas.openxmlformats.org/officeDocument/2006/relationships" xmlns:m="http://schemas.openxmlformats.org/officeDocument/2006/math" xmlns:v="urn:schemas-microsoft-com:vml" xmlns:wp14="http://schemas.microsoft.com/office/word/2010/wordprocessingDrawing" xmlns:wp="http://schemas.openxmlformats.org/drawingml/2006/wordprocessingDrawing" xmlns:w10="urn:schemas-microsoft-com:office:word" xmlns:w="http://schemas.openxmlformats.org/wordprocessingml/2006/main" xmlns:w14="http://schemas.microsoft.com/office/word/2010/wordml" xmlns:w15="http://schemas.microsoft.com/office/word/2012/wordml" xmlns:w16se="http://schemas.microsoft.com/office/word/2015/wordml/symex" xmlns:wpg="http://schemas.microsoft.com/office/word/2010/wordprocessingGroup" xmlns:wpi="http://schemas.microsoft.com/office/word/2010/wordprocessingInk" xmlns:wne="http://schemas.microsoft.com/office/word/2006/wordml" xmlns:wps="http://schemas.microsoft.com/office/word/2010/wordprocessingShape" mc:Ignorable="w14 w15 w16se wp14">
+<w:numbering xmlns:wpc="http://schemas.microsoft.com/office/word/2010/wordprocessingCanvas" xmlns:cx="http://schemas.microsoft.com/office/drawing/2014/chartex" xmlns:cx1="http://schemas.microsoft.com/office/drawing/2015/9/8/chartex" xmlns:cx2="http://schemas.microsoft.com/office/drawing/2015/10/21/chartex" xmlns:cx3="http://schemas.microsoft.com/office/drawing/2016/5/9/chartex" xmlns:cx4="http://schemas.microsoft.com/office/drawing/2016/5/10/chartex" xmlns:cx5="http://schemas.microsoft.com/office/drawing/2016/5/11/chartex" xmlns:cx6="http://schemas.microsoft.com/office/drawing/2016/5/12/chartex" xmlns:cx7="http://schemas.microsoft.com/office/drawing/2016/5/13/chartex" xmlns:cx8="http://schemas.microsoft.com/office/drawing/2016/5/14/chartex" xmlns:mc="http://schemas.openxmlformats.org/markup-compatibility/2006" xmlns:aink="http://schemas.microsoft.com/office/drawing/2016/ink" xmlns:am3d="http://schemas.microsoft.com/office/drawing/2017/model3d" xmlns:o="urn:schemas-microsoft-com:office:office" xmlns:oel="http://schemas.microsoft.com/office/2019/extlst" xmlns:r="http://schemas.openxmlformats.org/officeDocument/2006/relationships" xmlns:m="http://schemas.openxmlformats.org/officeDocument/2006/math" xmlns:v="urn:schemas-microsoft-com:vml" xmlns:wp14="http://schemas.microsoft.com/office/word/2010/wordprocessingDrawing" xmlns:wp="http://schemas.openxmlformats.org/drawingml/2006/wordprocessingDrawing" xmlns:w10="urn:schemas-microsoft-com:office:word" xmlns:w="http://schemas.openxmlformats.org/wordprocessingml/2006/main" xmlns:w14="http://schemas.microsoft.com/office/word/2010/wordml" xmlns:w15="http://schemas.microsoft.com/office/word/2012/wordml" xmlns:w16cex="http://schemas.microsoft.com/office/word/2018/wordml/cex" xmlns:w16cid="http://schemas.microsoft.com/office/word/2016/wordml/cid" xmlns:w16="http://schemas.microsoft.com/office/word/2018/wordml" xmlns:w16du="http://schemas.microsoft.com/office/word/2023/wordml/word16du" xmlns:w16sdtdh="http://schemas.microsoft.com/office/word/2020/wordml/sdtdatahash" xmlns:w16sdtfl="http://schemas.microsoft.com/office/word/2024/wordml/sdtformatlock" xmlns:w16se="http://schemas.microsoft.com/office/word/2015/wordml/symex" xmlns:wpg="http://schemas.microsoft.com/office/word/2010/wordprocessingGroup" xmlns:wpi="http://schemas.microsoft.com/office/word/2010/wordprocessingInk" xmlns:wne="http://schemas.microsoft.com/office/word/2006/wordml" xmlns:wps="http://schemas.microsoft.com/office/word/2010/wordprocessingShape" mc:Ignorable="w14 w15 w16se w16cid w16 w16cex w16sdtdh w16sdtfl w16du wp14">
   <w:abstractNum w:abstractNumId="0" w15:restartNumberingAfterBreak="0">
     <w:nsid w:val="049156A1"/>
     <w:multiLevelType w:val="hybridMultilevel"/>
@@ -6639,124 +6581,124 @@
       </w:rPr>
     </w:lvl>
   </w:abstractNum>
-  <w:num w:numId="1">
+  <w:num w:numId="1" w16cid:durableId="1725327970">
     <w:abstractNumId w:val="3"/>
   </w:num>
-  <w:num w:numId="2">
+  <w:num w:numId="2" w16cid:durableId="1316109238">
     <w:abstractNumId w:val="8"/>
   </w:num>
-  <w:num w:numId="3">
+  <w:num w:numId="3" w16cid:durableId="62680175">
     <w:abstractNumId w:val="12"/>
   </w:num>
-  <w:num w:numId="4">
+  <w:num w:numId="4" w16cid:durableId="820929368">
     <w:abstractNumId w:val="28"/>
   </w:num>
-  <w:num w:numId="5">
+  <w:num w:numId="5" w16cid:durableId="936521968">
     <w:abstractNumId w:val="30"/>
   </w:num>
-  <w:num w:numId="6">
+  <w:num w:numId="6" w16cid:durableId="602999354">
     <w:abstractNumId w:val="4"/>
   </w:num>
-  <w:num w:numId="7">
+  <w:num w:numId="7" w16cid:durableId="36321020">
     <w:abstractNumId w:val="11"/>
   </w:num>
-  <w:num w:numId="8">
+  <w:num w:numId="8" w16cid:durableId="2124837061">
     <w:abstractNumId w:val="19"/>
   </w:num>
-  <w:num w:numId="9">
+  <w:num w:numId="9" w16cid:durableId="1697656672">
     <w:abstractNumId w:val="15"/>
   </w:num>
-  <w:num w:numId="10">
+  <w:num w:numId="10" w16cid:durableId="1208949207">
     <w:abstractNumId w:val="9"/>
   </w:num>
-  <w:num w:numId="11">
+  <w:num w:numId="11" w16cid:durableId="881744500">
     <w:abstractNumId w:val="24"/>
   </w:num>
-  <w:num w:numId="12">
+  <w:num w:numId="12" w16cid:durableId="1872645307">
     <w:abstractNumId w:val="35"/>
   </w:num>
-  <w:num w:numId="13">
+  <w:num w:numId="13" w16cid:durableId="58796679">
     <w:abstractNumId w:val="29"/>
   </w:num>
-  <w:num w:numId="14">
+  <w:num w:numId="14" w16cid:durableId="1770081635">
     <w:abstractNumId w:val="1"/>
   </w:num>
-  <w:num w:numId="15">
+  <w:num w:numId="15" w16cid:durableId="138502717">
     <w:abstractNumId w:val="36"/>
   </w:num>
-  <w:num w:numId="16">
+  <w:num w:numId="16" w16cid:durableId="822745918">
     <w:abstractNumId w:val="21"/>
   </w:num>
-  <w:num w:numId="17">
+  <w:num w:numId="17" w16cid:durableId="1925259541">
     <w:abstractNumId w:val="17"/>
   </w:num>
-  <w:num w:numId="18">
+  <w:num w:numId="18" w16cid:durableId="251865498">
     <w:abstractNumId w:val="31"/>
   </w:num>
-  <w:num w:numId="19">
+  <w:num w:numId="19" w16cid:durableId="1947033776">
     <w:abstractNumId w:val="10"/>
   </w:num>
-  <w:num w:numId="20">
+  <w:num w:numId="20" w16cid:durableId="1459299173">
     <w:abstractNumId w:val="39"/>
   </w:num>
-  <w:num w:numId="21">
+  <w:num w:numId="21" w16cid:durableId="1961951841">
     <w:abstractNumId w:val="34"/>
   </w:num>
-  <w:num w:numId="22">
+  <w:num w:numId="22" w16cid:durableId="1077242461">
     <w:abstractNumId w:val="13"/>
   </w:num>
-  <w:num w:numId="23">
+  <w:num w:numId="23" w16cid:durableId="528301643">
     <w:abstractNumId w:val="14"/>
   </w:num>
-  <w:num w:numId="24">
+  <w:num w:numId="24" w16cid:durableId="1443915576">
     <w:abstractNumId w:val="5"/>
   </w:num>
-  <w:num w:numId="25">
+  <w:num w:numId="25" w16cid:durableId="149298123">
     <w:abstractNumId w:val="16"/>
   </w:num>
-  <w:num w:numId="26">
+  <w:num w:numId="26" w16cid:durableId="43330602">
     <w:abstractNumId w:val="20"/>
   </w:num>
-  <w:num w:numId="27">
+  <w:num w:numId="27" w16cid:durableId="1292714596">
     <w:abstractNumId w:val="23"/>
   </w:num>
-  <w:num w:numId="28">
+  <w:num w:numId="28" w16cid:durableId="1979795747">
     <w:abstractNumId w:val="0"/>
   </w:num>
-  <w:num w:numId="29">
+  <w:num w:numId="29" w16cid:durableId="1484353717">
     <w:abstractNumId w:val="18"/>
   </w:num>
-  <w:num w:numId="30">
+  <w:num w:numId="30" w16cid:durableId="904030965">
     <w:abstractNumId w:val="22"/>
   </w:num>
-  <w:num w:numId="31">
+  <w:num w:numId="31" w16cid:durableId="150372166">
     <w:abstractNumId w:val="2"/>
   </w:num>
-  <w:num w:numId="32">
+  <w:num w:numId="32" w16cid:durableId="211043709">
     <w:abstractNumId w:val="7"/>
   </w:num>
-  <w:num w:numId="33">
+  <w:num w:numId="33" w16cid:durableId="163474492">
     <w:abstractNumId w:val="32"/>
   </w:num>
-  <w:num w:numId="34">
+  <w:num w:numId="34" w16cid:durableId="1516920000">
     <w:abstractNumId w:val="38"/>
   </w:num>
-  <w:num w:numId="35">
+  <w:num w:numId="35" w16cid:durableId="452094705">
     <w:abstractNumId w:val="6"/>
   </w:num>
-  <w:num w:numId="36">
+  <w:num w:numId="36" w16cid:durableId="2587486">
     <w:abstractNumId w:val="25"/>
   </w:num>
-  <w:num w:numId="37">
+  <w:num w:numId="37" w16cid:durableId="130833930">
     <w:abstractNumId w:val="37"/>
   </w:num>
-  <w:num w:numId="38">
+  <w:num w:numId="38" w16cid:durableId="517474355">
     <w:abstractNumId w:val="27"/>
   </w:num>
-  <w:num w:numId="39">
+  <w:num w:numId="39" w16cid:durableId="1095590111">
     <w:abstractNumId w:val="26"/>
   </w:num>
-  <w:num w:numId="40">
+  <w:num w:numId="40" w16cid:durableId="1522745149">
     <w:abstractNumId w:val="33"/>
   </w:num>
   <w:numIdMacAtCleanup w:val="18"/>
@@ -6764,7 +6706,7 @@
 </file>
 
 <file path=word/styles.xml><?xml version="1.0" encoding="utf-8"?>
-<w:styles xmlns:mc="http://schemas.openxmlformats.org/markup-compatibility/2006" xmlns:r="http://schemas.openxmlformats.org/officeDocument/2006/relationships" xmlns:w="http://schemas.openxmlformats.org/wordprocessingml/2006/main" xmlns:w14="http://schemas.microsoft.com/office/word/2010/wordml" xmlns:w15="http://schemas.microsoft.com/office/word/2012/wordml" xmlns:w16se="http://schemas.microsoft.com/office/word/2015/wordml/symex" mc:Ignorable="w14 w15 w16se">
+<w:styles xmlns:mc="http://schemas.openxmlformats.org/markup-compatibility/2006" xmlns:r="http://schemas.openxmlformats.org/officeDocument/2006/relationships" xmlns:w="http://schemas.openxmlformats.org/wordprocessingml/2006/main" xmlns:w14="http://schemas.microsoft.com/office/word/2010/wordml" xmlns:w15="http://schemas.microsoft.com/office/word/2012/wordml" xmlns:w16cex="http://schemas.microsoft.com/office/word/2018/wordml/cex" xmlns:w16cid="http://schemas.microsoft.com/office/word/2016/wordml/cid" xmlns:w16="http://schemas.microsoft.com/office/word/2018/wordml" xmlns:w16du="http://schemas.microsoft.com/office/word/2023/wordml/word16du" xmlns:w16sdtdh="http://schemas.microsoft.com/office/word/2020/wordml/sdtdatahash" xmlns:w16sdtfl="http://schemas.microsoft.com/office/word/2024/wordml/sdtformatlock" xmlns:w16se="http://schemas.microsoft.com/office/word/2015/wordml/symex" mc:Ignorable="w14 w15 w16se w16cid w16 w16cex w16sdtdh w16sdtfl w16du">
   <w:docDefaults>
     <w:rPrDefault>
       <w:rPr>
@@ -6780,7 +6722,7 @@
       </w:pPr>
     </w:pPrDefault>
   </w:docDefaults>
-  <w:latentStyles w:defLockedState="0" w:defUIPriority="99" w:defSemiHidden="0" w:defUnhideWhenUsed="0" w:defQFormat="0" w:count="371">
+  <w:latentStyles w:defLockedState="0" w:defUIPriority="99" w:defSemiHidden="0" w:defUnhideWhenUsed="0" w:defQFormat="0" w:count="376">
     <w:lsdException w:name="Normal" w:uiPriority="0" w:qFormat="1"/>
     <w:lsdException w:name="heading 1" w:uiPriority="9" w:qFormat="1"/>
     <w:lsdException w:name="heading 2" w:semiHidden="1" w:uiPriority="9" w:unhideWhenUsed="1" w:qFormat="1"/>
@@ -7152,6 +7094,11 @@
     <w:lsdException w:name="List Table 5 Dark Accent 6" w:uiPriority="50"/>
     <w:lsdException w:name="List Table 6 Colorful Accent 6" w:uiPriority="51"/>
     <w:lsdException w:name="List Table 7 Colorful Accent 6" w:uiPriority="52"/>
+    <w:lsdException w:name="Mention" w:semiHidden="1" w:unhideWhenUsed="1"/>
+    <w:lsdException w:name="Smart Hyperlink" w:semiHidden="1" w:unhideWhenUsed="1"/>
+    <w:lsdException w:name="Hashtag" w:semiHidden="1" w:unhideWhenUsed="1"/>
+    <w:lsdException w:name="Unresolved Mention" w:semiHidden="1" w:unhideWhenUsed="1"/>
+    <w:lsdException w:name="Smart Link" w:semiHidden="1" w:unhideWhenUsed="1"/>
   </w:latentStyles>
   <w:style w:type="paragraph" w:default="1" w:styleId="Normal">
     <w:name w:val="Normal"/>
@@ -8135,7 +8082,7 @@
       <w:szCs w:val="24"/>
     </w:rPr>
   </w:style>
-  <w:style w:type="table" w:styleId="Cuadrculadetablaclara">
+  <w:style w:type="table" w:styleId="Tablaconcuadrculaclara">
     <w:name w:val="Grid Table Light"/>
     <w:basedOn w:val="Tablanormal"/>
     <w:uiPriority w:val="40"/>
@@ -8157,7 +8104,7 @@
   <w:style w:type="table" w:customStyle="1" w:styleId="Cuadrculadetablaclara1">
     <w:name w:val="Cuadrícula de tabla clara1"/>
     <w:basedOn w:val="Tablanormal"/>
-    <w:next w:val="Cuadrculadetablaclara"/>
+    <w:next w:val="Tablaconcuadrculaclara"/>
     <w:uiPriority w:val="40"/>
     <w:rsid w:val="00943DF1"/>
     <w:pPr>
@@ -8198,7 +8145,7 @@
       <w:spacing w:after="0" w:line="240" w:lineRule="auto"/>
     </w:pPr>
   </w:style>
-  <w:style w:type="character" w:styleId="Textoennegrita">
+  <w:style w:type="character" w:styleId="Fuerte">
     <w:name w:val="Strong"/>
     <w:basedOn w:val="Fuentedeprrafopredeter"/>
     <w:uiPriority w:val="22"/>
@@ -8210,532 +8157,6 @@
     </w:rPr>
   </w:style>
 </w:styles>
-</file>
-
-<file path=word/glossary/document.xml><?xml version="1.0" encoding="utf-8"?>
-<w:glossaryDocument xmlns:wpc="http://schemas.microsoft.com/office/word/2010/wordprocessingCanvas" xmlns:cx="http://schemas.microsoft.com/office/drawing/2014/chartex" xmlns:mc="http://schemas.openxmlformats.org/markup-compatibility/2006" xmlns:o="urn:schemas-microsoft-com:office:office" xmlns:r="http://schemas.openxmlformats.org/officeDocument/2006/relationships" xmlns:m="http://schemas.openxmlformats.org/officeDocument/2006/math" xmlns:v="urn:schemas-microsoft-com:vml" xmlns:wp14="http://schemas.microsoft.com/office/word/2010/wordprocessingDrawing" xmlns:wp="http://schemas.openxmlformats.org/drawingml/2006/wordprocessingDrawing" xmlns:w10="urn:schemas-microsoft-com:office:word" xmlns:w="http://schemas.openxmlformats.org/wordprocessingml/2006/main" xmlns:w14="http://schemas.microsoft.com/office/word/2010/wordml" xmlns:w15="http://schemas.microsoft.com/office/word/2012/wordml" xmlns:w16se="http://schemas.microsoft.com/office/word/2015/wordml/symex" xmlns:wpg="http://schemas.microsoft.com/office/word/2010/wordprocessingGroup" xmlns:wpi="http://schemas.microsoft.com/office/word/2010/wordprocessingInk" xmlns:wne="http://schemas.microsoft.com/office/word/2006/wordml" xmlns:wps="http://schemas.microsoft.com/office/word/2010/wordprocessingShape" mc:Ignorable="w14 w15 w16se wp14"/>
-</file>
-
-<file path=word/glossary/fontTable.xml><?xml version="1.0" encoding="utf-8"?>
-<w:fonts xmlns:mc="http://schemas.openxmlformats.org/markup-compatibility/2006" xmlns:r="http://schemas.openxmlformats.org/officeDocument/2006/relationships" xmlns:w="http://schemas.openxmlformats.org/wordprocessingml/2006/main" xmlns:w14="http://schemas.microsoft.com/office/word/2010/wordml" xmlns:w15="http://schemas.microsoft.com/office/word/2012/wordml" xmlns:w16se="http://schemas.microsoft.com/office/word/2015/wordml/symex" mc:Ignorable="w14 w15 w16se">
-  <w:font w:name="Calibri">
-    <w:panose1 w:val="020F0502020204030204"/>
-    <w:charset w:val="00"/>
-    <w:family w:val="swiss"/>
-    <w:pitch w:val="variable"/>
-    <w:sig w:usb0="E4002EFF" w:usb1="C000247B" w:usb2="00000009" w:usb3="00000000" w:csb0="000001FF" w:csb1="00000000"/>
-  </w:font>
-  <w:font w:name="Times New Roman">
-    <w:panose1 w:val="02020603050405020304"/>
-    <w:charset w:val="00"/>
-    <w:family w:val="roman"/>
-    <w:pitch w:val="variable"/>
-    <w:sig w:usb0="E0002EFF" w:usb1="C000785B" w:usb2="00000009" w:usb3="00000000" w:csb0="000001FF" w:csb1="00000000"/>
-  </w:font>
-  <w:font w:name="Courier New">
-    <w:panose1 w:val="02070309020205020404"/>
-    <w:charset w:val="00"/>
-    <w:family w:val="modern"/>
-    <w:pitch w:val="fixed"/>
-    <w:sig w:usb0="E0002EFF" w:usb1="C0007843" w:usb2="00000009" w:usb3="00000000" w:csb0="000001FF" w:csb1="00000000"/>
-  </w:font>
-  <w:font w:name="Wingdings">
-    <w:panose1 w:val="05000000000000000000"/>
-    <w:charset w:val="02"/>
-    <w:family w:val="auto"/>
-    <w:pitch w:val="variable"/>
-    <w:sig w:usb0="00000000" w:usb1="10000000" w:usb2="00000000" w:usb3="00000000" w:csb0="80000000" w:csb1="00000000"/>
-  </w:font>
-  <w:font w:name="Symbol">
-    <w:panose1 w:val="05050102010706020507"/>
-    <w:charset w:val="02"/>
-    <w:family w:val="roman"/>
-    <w:pitch w:val="variable"/>
-    <w:sig w:usb0="00000000" w:usb1="10000000" w:usb2="00000000" w:usb3="00000000" w:csb0="80000000" w:csb1="00000000"/>
-  </w:font>
-  <w:font w:name="Calibri Light">
-    <w:panose1 w:val="020F0302020204030204"/>
-    <w:charset w:val="00"/>
-    <w:family w:val="swiss"/>
-    <w:pitch w:val="variable"/>
-    <w:sig w:usb0="E4002EFF" w:usb1="C000247B" w:usb2="00000009" w:usb3="00000000" w:csb0="000001FF" w:csb1="00000000"/>
-  </w:font>
-  <w:font w:name="Segoe UI">
-    <w:panose1 w:val="020B0502040204020203"/>
-    <w:charset w:val="00"/>
-    <w:family w:val="swiss"/>
-    <w:pitch w:val="variable"/>
-    <w:sig w:usb0="E4002EFF" w:usb1="C000E47F" w:usb2="00000009" w:usb3="00000000" w:csb0="000001FF" w:csb1="00000000"/>
-  </w:font>
-  <w:font w:name="Century Gothic">
-    <w:panose1 w:val="020B0502020202020204"/>
-    <w:charset w:val="00"/>
-    <w:family w:val="swiss"/>
-    <w:pitch w:val="variable"/>
-    <w:sig w:usb0="00000287" w:usb1="00000000" w:usb2="00000000" w:usb3="00000000" w:csb0="0000009F" w:csb1="00000000"/>
-  </w:font>
-</w:fonts>
-</file>
-
-<file path=word/glossary/settings.xml><?xml version="1.0" encoding="utf-8"?>
-<w:settings xmlns:mc="http://schemas.openxmlformats.org/markup-compatibility/2006" xmlns:o="urn:schemas-microsoft-com:office:office" xmlns:r="http://schemas.openxmlformats.org/officeDocument/2006/relationships" xmlns:m="http://schemas.openxmlformats.org/officeDocument/2006/math" xmlns:v="urn:schemas-microsoft-com:vml" xmlns:w10="urn:schemas-microsoft-com:office:word" xmlns:w="http://schemas.openxmlformats.org/wordprocessingml/2006/main" xmlns:w14="http://schemas.microsoft.com/office/word/2010/wordml" xmlns:w15="http://schemas.microsoft.com/office/word/2012/wordml" xmlns:w16se="http://schemas.microsoft.com/office/word/2015/wordml/symex" xmlns:sl="http://schemas.openxmlformats.org/schemaLibrary/2006/main" mc:Ignorable="w14 w15 w16se">
-  <w:defaultTabStop w:val="708"/>
-  <w:hyphenationZone w:val="425"/>
-  <w:characterSpacingControl w:val="doNotCompress"/>
-  <w:compat>
-    <w:useFELayout/>
-    <w:compatSetting w:name="compatibilityMode" w:uri="http://schemas.microsoft.com/office/word" w:val="12"/>
-  </w:compat>
-  <w:rsids>
-    <w:rsidRoot w:val="008F14D6"/>
-    <w:rsid w:val="008F14D6"/>
-  </w:rsids>
-  <m:mathPr>
-    <m:mathFont m:val="Cambria Math"/>
-    <m:brkBin m:val="before"/>
-    <m:brkBinSub m:val="--"/>
-    <m:smallFrac m:val="0"/>
-    <m:dispDef/>
-    <m:lMargin m:val="0"/>
-    <m:rMargin m:val="0"/>
-    <m:defJc m:val="centerGroup"/>
-    <m:wrapIndent m:val="1440"/>
-    <m:intLim m:val="subSup"/>
-    <m:naryLim m:val="undOvr"/>
-  </m:mathPr>
-  <w:themeFontLang w:val="es-CL"/>
-  <w:clrSchemeMapping w:bg1="light1" w:t1="dark1" w:bg2="light2" w:t2="dark2" w:accent1="accent1" w:accent2="accent2" w:accent3="accent3" w:accent4="accent4" w:accent5="accent5" w:accent6="accent6" w:hyperlink="hyperlink" w:followedHyperlink="followedHyperlink"/>
-  <w:decimalSymbol w:val=","/>
-  <w:listSeparator w:val=";"/>
-</w:settings>
-</file>
-
-<file path=word/glossary/styles.xml><?xml version="1.0" encoding="utf-8"?>
-<w:styles xmlns:mc="http://schemas.openxmlformats.org/markup-compatibility/2006" xmlns:r="http://schemas.openxmlformats.org/officeDocument/2006/relationships" xmlns:w="http://schemas.openxmlformats.org/wordprocessingml/2006/main" xmlns:w14="http://schemas.microsoft.com/office/word/2010/wordml" xmlns:w15="http://schemas.microsoft.com/office/word/2012/wordml" xmlns:w16se="http://schemas.microsoft.com/office/word/2015/wordml/symex" mc:Ignorable="w14 w15 w16se">
-  <w:docDefaults>
-    <w:rPrDefault>
-      <w:rPr>
-        <w:rFonts w:asciiTheme="minorHAnsi" w:eastAsiaTheme="minorEastAsia" w:hAnsiTheme="minorHAnsi" w:cstheme="minorBidi"/>
-        <w:sz w:val="22"/>
-        <w:szCs w:val="22"/>
-        <w:lang w:val="es-CL" w:eastAsia="es-CL" w:bidi="ar-SA"/>
-      </w:rPr>
-    </w:rPrDefault>
-    <w:pPrDefault>
-      <w:pPr>
-        <w:spacing w:after="160" w:line="259" w:lineRule="auto"/>
-      </w:pPr>
-    </w:pPrDefault>
-  </w:docDefaults>
-  <w:latentStyles w:defLockedState="0" w:defUIPriority="99" w:defSemiHidden="0" w:defUnhideWhenUsed="0" w:defQFormat="0" w:count="371">
-    <w:lsdException w:name="Normal" w:uiPriority="0" w:qFormat="1"/>
-    <w:lsdException w:name="heading 1" w:uiPriority="9" w:qFormat="1"/>
-    <w:lsdException w:name="heading 2" w:semiHidden="1" w:uiPriority="9" w:unhideWhenUsed="1" w:qFormat="1"/>
-    <w:lsdException w:name="heading 3" w:semiHidden="1" w:uiPriority="9" w:unhideWhenUsed="1" w:qFormat="1"/>
-    <w:lsdException w:name="heading 4" w:semiHidden="1" w:uiPriority="9" w:unhideWhenUsed="1" w:qFormat="1"/>
-    <w:lsdException w:name="heading 5" w:semiHidden="1" w:uiPriority="9" w:unhideWhenUsed="1" w:qFormat="1"/>
-    <w:lsdException w:name="heading 6" w:semiHidden="1" w:uiPriority="9" w:unhideWhenUsed="1" w:qFormat="1"/>
-    <w:lsdException w:name="heading 7" w:semiHidden="1" w:uiPriority="9" w:unhideWhenUsed="1" w:qFormat="1"/>
-    <w:lsdException w:name="heading 8" w:semiHidden="1" w:uiPriority="9" w:unhideWhenUsed="1" w:qFormat="1"/>
-    <w:lsdException w:name="heading 9" w:semiHidden="1" w:uiPriority="9" w:unhideWhenUsed="1" w:qFormat="1"/>
-    <w:lsdException w:name="index 1" w:semiHidden="1" w:unhideWhenUsed="1"/>
-    <w:lsdException w:name="index 2" w:semiHidden="1" w:unhideWhenUsed="1"/>
-    <w:lsdException w:name="index 3" w:semiHidden="1" w:unhideWhenUsed="1"/>
-    <w:lsdException w:name="index 4" w:semiHidden="1" w:unhideWhenUsed="1"/>
-    <w:lsdException w:name="index 5" w:semiHidden="1" w:unhideWhenUsed="1"/>
-    <w:lsdException w:name="index 6" w:semiHidden="1" w:unhideWhenUsed="1"/>
-    <w:lsdException w:name="index 7" w:semiHidden="1" w:unhideWhenUsed="1"/>
-    <w:lsdException w:name="index 8" w:semiHidden="1" w:unhideWhenUsed="1"/>
-    <w:lsdException w:name="index 9" w:semiHidden="1" w:unhideWhenUsed="1"/>
-    <w:lsdException w:name="toc 1" w:semiHidden="1" w:uiPriority="39" w:unhideWhenUsed="1"/>
-    <w:lsdException w:name="toc 2" w:semiHidden="1" w:uiPriority="39" w:unhideWhenUsed="1"/>
-    <w:lsdException w:name="toc 3" w:semiHidden="1" w:uiPriority="39" w:unhideWhenUsed="1"/>
-    <w:lsdException w:name="toc 4" w:semiHidden="1" w:uiPriority="39" w:unhideWhenUsed="1"/>
-    <w:lsdException w:name="toc 5" w:semiHidden="1" w:uiPriority="39" w:unhideWhenUsed="1"/>
-    <w:lsdException w:name="toc 6" w:semiHidden="1" w:uiPriority="39" w:unhideWhenUsed="1"/>
-    <w:lsdException w:name="toc 7" w:semiHidden="1" w:uiPriority="39" w:unhideWhenUsed="1"/>
-    <w:lsdException w:name="toc 8" w:semiHidden="1" w:uiPriority="39" w:unhideWhenUsed="1"/>
-    <w:lsdException w:name="toc 9" w:semiHidden="1" w:uiPriority="39" w:unhideWhenUsed="1"/>
-    <w:lsdException w:name="Normal Indent" w:semiHidden="1" w:unhideWhenUsed="1"/>
-    <w:lsdException w:name="footnote text" w:semiHidden="1" w:unhideWhenUsed="1"/>
-    <w:lsdException w:name="annotation text" w:semiHidden="1" w:unhideWhenUsed="1"/>
-    <w:lsdException w:name="header" w:semiHidden="1" w:unhideWhenUsed="1"/>
-    <w:lsdException w:name="footer" w:semiHidden="1" w:unhideWhenUsed="1"/>
-    <w:lsdException w:name="index heading" w:semiHidden="1" w:unhideWhenUsed="1"/>
-    <w:lsdException w:name="caption" w:semiHidden="1" w:uiPriority="35" w:unhideWhenUsed="1" w:qFormat="1"/>
-    <w:lsdException w:name="table of figures" w:semiHidden="1" w:unhideWhenUsed="1"/>
-    <w:lsdException w:name="envelope address" w:semiHidden="1" w:unhideWhenUsed="1"/>
-    <w:lsdException w:name="envelope return" w:semiHidden="1" w:unhideWhenUsed="1"/>
-    <w:lsdException w:name="footnote reference" w:semiHidden="1" w:unhideWhenUsed="1"/>
-    <w:lsdException w:name="annotation reference" w:semiHidden="1" w:unhideWhenUsed="1"/>
-    <w:lsdException w:name="line number" w:semiHidden="1" w:unhideWhenUsed="1"/>
-    <w:lsdException w:name="page number" w:semiHidden="1" w:unhideWhenUsed="1"/>
-    <w:lsdException w:name="endnote reference" w:semiHidden="1" w:unhideWhenUsed="1"/>
-    <w:lsdException w:name="endnote text" w:semiHidden="1" w:unhideWhenUsed="1"/>
-    <w:lsdException w:name="table of authorities" w:semiHidden="1" w:unhideWhenUsed="1"/>
-    <w:lsdException w:name="macro" w:semiHidden="1" w:unhideWhenUsed="1"/>
-    <w:lsdException w:name="toa heading" w:semiHidden="1" w:unhideWhenUsed="1"/>
-    <w:lsdException w:name="List" w:semiHidden="1" w:unhideWhenUsed="1"/>
-    <w:lsdException w:name="List Bullet" w:semiHidden="1" w:unhideWhenUsed="1"/>
-    <w:lsdException w:name="List Number" w:semiHidden="1" w:unhideWhenUsed="1"/>
-    <w:lsdException w:name="List 2" w:semiHidden="1" w:unhideWhenUsed="1"/>
-    <w:lsdException w:name="List 3" w:semiHidden="1" w:unhideWhenUsed="1"/>
-    <w:lsdException w:name="List 4" w:semiHidden="1" w:unhideWhenUsed="1"/>
-    <w:lsdException w:name="List 5" w:semiHidden="1" w:unhideWhenUsed="1"/>
-    <w:lsdException w:name="List Bullet 2" w:semiHidden="1" w:unhideWhenUsed="1"/>
-    <w:lsdException w:name="List Bullet 3" w:semiHidden="1" w:unhideWhenUsed="1"/>
-    <w:lsdException w:name="List Bullet 4" w:semiHidden="1" w:unhideWhenUsed="1"/>
-    <w:lsdException w:name="List Bullet 5" w:semiHidden="1" w:unhideWhenUsed="1"/>
-    <w:lsdException w:name="List Number 2" w:semiHidden="1" w:unhideWhenUsed="1"/>
-    <w:lsdException w:name="List Number 3" w:semiHidden="1" w:unhideWhenUsed="1"/>
-    <w:lsdException w:name="List Number 4" w:semiHidden="1" w:unhideWhenUsed="1"/>
-    <w:lsdException w:name="List Number 5" w:semiHidden="1" w:unhideWhenUsed="1"/>
-    <w:lsdException w:name="Title" w:uiPriority="10" w:qFormat="1"/>
-    <w:lsdException w:name="Closing" w:semiHidden="1" w:unhideWhenUsed="1"/>
-    <w:lsdException w:name="Signature" w:semiHidden="1" w:unhideWhenUsed="1"/>
-    <w:lsdException w:name="Default Paragraph Font" w:semiHidden="1" w:uiPriority="1" w:unhideWhenUsed="1"/>
-    <w:lsdException w:name="Body Text" w:semiHidden="1" w:unhideWhenUsed="1"/>
-    <w:lsdException w:name="Body Text Indent" w:semiHidden="1" w:unhideWhenUsed="1"/>
-    <w:lsdException w:name="List Continue" w:semiHidden="1" w:unhideWhenUsed="1"/>
-    <w:lsdException w:name="List Continue 2" w:semiHidden="1" w:unhideWhenUsed="1"/>
-    <w:lsdException w:name="List Continue 3" w:semiHidden="1" w:unhideWhenUsed="1"/>
-    <w:lsdException w:name="List Continue 4" w:semiHidden="1" w:unhideWhenUsed="1"/>
-    <w:lsdException w:name="List Continue 5" w:semiHidden="1" w:unhideWhenUsed="1"/>
-    <w:lsdException w:name="Message Header" w:semiHidden="1" w:unhideWhenUsed="1"/>
-    <w:lsdException w:name="Subtitle" w:uiPriority="11" w:qFormat="1"/>
-    <w:lsdException w:name="Salutation" w:semiHidden="1" w:unhideWhenUsed="1"/>
-    <w:lsdException w:name="Date" w:semiHidden="1" w:unhideWhenUsed="1"/>
-    <w:lsdException w:name="Body Text First Indent" w:semiHidden="1" w:unhideWhenUsed="1"/>
-    <w:lsdException w:name="Body Text First Indent 2" w:semiHidden="1" w:unhideWhenUsed="1"/>
-    <w:lsdException w:name="Note Heading" w:semiHidden="1" w:unhideWhenUsed="1"/>
-    <w:lsdException w:name="Body Text 2" w:semiHidden="1" w:unhideWhenUsed="1"/>
-    <w:lsdException w:name="Body Text 3" w:semiHidden="1" w:unhideWhenUsed="1"/>
-    <w:lsdException w:name="Body Text Indent 2" w:semiHidden="1" w:unhideWhenUsed="1"/>
-    <w:lsdException w:name="Body Text Indent 3" w:semiHidden="1" w:unhideWhenUsed="1"/>
-    <w:lsdException w:name="Block Text" w:semiHidden="1" w:unhideWhenUsed="1"/>
-    <w:lsdException w:name="Hyperlink" w:semiHidden="1" w:unhideWhenUsed="1"/>
-    <w:lsdException w:name="FollowedHyperlink" w:semiHidden="1" w:unhideWhenUsed="1"/>
-    <w:lsdException w:name="Strong" w:uiPriority="22" w:qFormat="1"/>
-    <w:lsdException w:name="Emphasis" w:uiPriority="20" w:qFormat="1"/>
-    <w:lsdException w:name="Document Map" w:semiHidden="1" w:unhideWhenUsed="1"/>
-    <w:lsdException w:name="Plain Text" w:semiHidden="1" w:unhideWhenUsed="1"/>
-    <w:lsdException w:name="E-mail Signature" w:semiHidden="1" w:unhideWhenUsed="1"/>
-    <w:lsdException w:name="HTML Top of Form" w:semiHidden="1" w:unhideWhenUsed="1"/>
-    <w:lsdException w:name="HTML Bottom of Form" w:semiHidden="1" w:unhideWhenUsed="1"/>
-    <w:lsdException w:name="Normal (Web)" w:semiHidden="1" w:unhideWhenUsed="1"/>
-    <w:lsdException w:name="HTML Acronym" w:semiHidden="1" w:unhideWhenUsed="1"/>
-    <w:lsdException w:name="HTML Address" w:semiHidden="1" w:unhideWhenUsed="1"/>
-    <w:lsdException w:name="HTML Cite" w:semiHidden="1" w:unhideWhenUsed="1"/>
-    <w:lsdException w:name="HTML Code" w:semiHidden="1" w:unhideWhenUsed="1"/>
-    <w:lsdException w:name="HTML Definition" w:semiHidden="1" w:unhideWhenUsed="1"/>
-    <w:lsdException w:name="HTML Keyboard" w:semiHidden="1" w:unhideWhenUsed="1"/>
-    <w:lsdException w:name="HTML Preformatted" w:semiHidden="1" w:unhideWhenUsed="1"/>
-    <w:lsdException w:name="HTML Sample" w:semiHidden="1" w:unhideWhenUsed="1"/>
-    <w:lsdException w:name="HTML Typewriter" w:semiHidden="1" w:unhideWhenUsed="1"/>
-    <w:lsdException w:name="HTML Variable" w:semiHidden="1" w:unhideWhenUsed="1"/>
-    <w:lsdException w:name="Normal Table" w:semiHidden="1" w:unhideWhenUsed="1"/>
-    <w:lsdException w:name="annotation subject" w:semiHidden="1" w:unhideWhenUsed="1"/>
-    <w:lsdException w:name="No List" w:semiHidden="1" w:unhideWhenUsed="1"/>
-    <w:lsdException w:name="Outline List 1" w:semiHidden="1" w:unhideWhenUsed="1"/>
-    <w:lsdException w:name="Outline List 2" w:semiHidden="1" w:unhideWhenUsed="1"/>
-    <w:lsdException w:name="Outline List 3" w:semiHidden="1" w:unhideWhenUsed="1"/>
-    <w:lsdException w:name="Table Simple 1" w:semiHidden="1" w:unhideWhenUsed="1"/>
-    <w:lsdException w:name="Table Simple 2" w:semiHidden="1" w:unhideWhenUsed="1"/>
-    <w:lsdException w:name="Table Simple 3" w:semiHidden="1" w:unhideWhenUsed="1"/>
-    <w:lsdException w:name="Table Classic 1" w:semiHidden="1" w:unhideWhenUsed="1"/>
-    <w:lsdException w:name="Table Classic 2" w:semiHidden="1" w:unhideWhenUsed="1"/>
-    <w:lsdException w:name="Table Classic 3" w:semiHidden="1" w:unhideWhenUsed="1"/>
-    <w:lsdException w:name="Table Classic 4" w:semiHidden="1" w:unhideWhenUsed="1"/>
-    <w:lsdException w:name="Table Colorful 1" w:semiHidden="1" w:unhideWhenUsed="1"/>
-    <w:lsdException w:name="Table Colorful 2" w:semiHidden="1" w:unhideWhenUsed="1"/>
-    <w:lsdException w:name="Table Colorful 3" w:semiHidden="1" w:unhideWhenUsed="1"/>
-    <w:lsdException w:name="Table Columns 1" w:semiHidden="1" w:unhideWhenUsed="1"/>
-    <w:lsdException w:name="Table Columns 2" w:semiHidden="1" w:unhideWhenUsed="1"/>
-    <w:lsdException w:name="Table Columns 3" w:semiHidden="1" w:unhideWhenUsed="1"/>
-    <w:lsdException w:name="Table Columns 4" w:semiHidden="1" w:unhideWhenUsed="1"/>
-    <w:lsdException w:name="Table Columns 5" w:semiHidden="1" w:unhideWhenUsed="1"/>
-    <w:lsdException w:name="Table Grid 1" w:semiHidden="1" w:unhideWhenUsed="1"/>
-    <w:lsdException w:name="Table Grid 2" w:semiHidden="1" w:unhideWhenUsed="1"/>
-    <w:lsdException w:name="Table Grid 3" w:semiHidden="1" w:unhideWhenUsed="1"/>
-    <w:lsdException w:name="Table Grid 4" w:semiHidden="1" w:unhideWhenUsed="1"/>
-    <w:lsdException w:name="Table Grid 5" w:semiHidden="1" w:unhideWhenUsed="1"/>
-    <w:lsdException w:name="Table Grid 6" w:semiHidden="1" w:unhideWhenUsed="1"/>
-    <w:lsdException w:name="Table Grid 7" w:semiHidden="1" w:unhideWhenUsed="1"/>
-    <w:lsdException w:name="Table Grid 8" w:semiHidden="1" w:unhideWhenUsed="1"/>
-    <w:lsdException w:name="Table List 1" w:semiHidden="1" w:unhideWhenUsed="1"/>
-    <w:lsdException w:name="Table List 2" w:semiHidden="1" w:unhideWhenUsed="1"/>
-    <w:lsdException w:name="Table List 3" w:semiHidden="1" w:unhideWhenUsed="1"/>
-    <w:lsdException w:name="Table List 4" w:semiHidden="1" w:unhideWhenUsed="1"/>
-    <w:lsdException w:name="Table List 5" w:semiHidden="1" w:unhideWhenUsed="1"/>
-    <w:lsdException w:name="Table List 6" w:semiHidden="1" w:unhideWhenUsed="1"/>
-    <w:lsdException w:name="Table List 7" w:semiHidden="1" w:unhideWhenUsed="1"/>
-    <w:lsdException w:name="Table List 8" w:semiHidden="1" w:unhideWhenUsed="1"/>
-    <w:lsdException w:name="Table 3D effects 1" w:semiHidden="1" w:unhideWhenUsed="1"/>
-    <w:lsdException w:name="Table 3D effects 2" w:semiHidden="1" w:unhideWhenUsed="1"/>
-    <w:lsdException w:name="Table 3D effects 3" w:semiHidden="1" w:unhideWhenUsed="1"/>
-    <w:lsdException w:name="Table Contemporary" w:semiHidden="1" w:unhideWhenUsed="1"/>
-    <w:lsdException w:name="Table Elegant" w:semiHidden="1" w:unhideWhenUsed="1"/>
-    <w:lsdException w:name="Table Professional" w:semiHidden="1" w:unhideWhenUsed="1"/>
-    <w:lsdException w:name="Table Subtle 1" w:semiHidden="1" w:unhideWhenUsed="1"/>
-    <w:lsdException w:name="Table Subtle 2" w:semiHidden="1" w:unhideWhenUsed="1"/>
-    <w:lsdException w:name="Table Web 1" w:semiHidden="1" w:unhideWhenUsed="1"/>
-    <w:lsdException w:name="Table Web 2" w:semiHidden="1" w:unhideWhenUsed="1"/>
-    <w:lsdException w:name="Table Web 3" w:semiHidden="1" w:unhideWhenUsed="1"/>
-    <w:lsdException w:name="Balloon Text" w:semiHidden="1" w:unhideWhenUsed="1"/>
-    <w:lsdException w:name="Table Grid" w:uiPriority="39"/>
-    <w:lsdException w:name="Table Theme" w:semiHidden="1" w:unhideWhenUsed="1"/>
-    <w:lsdException w:name="Placeholder Text" w:semiHidden="1"/>
-    <w:lsdException w:name="No Spacing" w:uiPriority="1" w:qFormat="1"/>
-    <w:lsdException w:name="Light Shading" w:uiPriority="60"/>
-    <w:lsdException w:name="Light List" w:uiPriority="61"/>
-    <w:lsdException w:name="Light Grid" w:uiPriority="62"/>
-    <w:lsdException w:name="Medium Shading 1" w:uiPriority="63"/>
-    <w:lsdException w:name="Medium Shading 2" w:uiPriority="64"/>
-    <w:lsdException w:name="Medium List 1" w:uiPriority="65"/>
-    <w:lsdException w:name="Medium List 2" w:uiPriority="66"/>
-    <w:lsdException w:name="Medium Grid 1" w:uiPriority="67"/>
-    <w:lsdException w:name="Medium Grid 2" w:uiPriority="68"/>
-    <w:lsdException w:name="Medium Grid 3" w:uiPriority="69"/>
-    <w:lsdException w:name="Dark List" w:uiPriority="70"/>
-    <w:lsdException w:name="Colorful Shading" w:uiPriority="71"/>
-    <w:lsdException w:name="Colorful List" w:uiPriority="72"/>
-    <w:lsdException w:name="Colorful Grid" w:uiPriority="73"/>
-    <w:lsdException w:name="Light Shading Accent 1" w:uiPriority="60"/>
-    <w:lsdException w:name="Light List Accent 1" w:uiPriority="61"/>
-    <w:lsdException w:name="Light Grid Accent 1" w:uiPriority="62"/>
-    <w:lsdException w:name="Medium Shading 1 Accent 1" w:uiPriority="63"/>
-    <w:lsdException w:name="Medium Shading 2 Accent 1" w:uiPriority="64"/>
-    <w:lsdException w:name="Medium List 1 Accent 1" w:uiPriority="65"/>
-    <w:lsdException w:name="Revision" w:semiHidden="1"/>
-    <w:lsdException w:name="List Paragraph" w:uiPriority="34" w:qFormat="1"/>
-    <w:lsdException w:name="Quote" w:uiPriority="29" w:qFormat="1"/>
-    <w:lsdException w:name="Intense Quote" w:uiPriority="30" w:qFormat="1"/>
-    <w:lsdException w:name="Medium List 2 Accent 1" w:uiPriority="66"/>
-    <w:lsdException w:name="Medium Grid 1 Accent 1" w:uiPriority="67"/>
-    <w:lsdException w:name="Medium Grid 2 Accent 1" w:uiPriority="68"/>
-    <w:lsdException w:name="Medium Grid 3 Accent 1" w:uiPriority="69"/>
-    <w:lsdException w:name="Dark List Accent 1" w:uiPriority="70"/>
-    <w:lsdException w:name="Colorful Shading Accent 1" w:uiPriority="71"/>
-    <w:lsdException w:name="Colorful List Accent 1" w:uiPriority="72"/>
-    <w:lsdException w:name="Colorful Grid Accent 1" w:uiPriority="73"/>
-    <w:lsdException w:name="Light Shading Accent 2" w:uiPriority="60"/>
-    <w:lsdException w:name="Light List Accent 2" w:uiPriority="61"/>
-    <w:lsdException w:name="Light Grid Accent 2" w:uiPriority="62"/>
-    <w:lsdException w:name="Medium Shading 1 Accent 2" w:uiPriority="63"/>
-    <w:lsdException w:name="Medium Shading 2 Accent 2" w:uiPriority="64"/>
-    <w:lsdException w:name="Medium List 1 Accent 2" w:uiPriority="65"/>
-    <w:lsdException w:name="Medium List 2 Accent 2" w:uiPriority="66"/>
-    <w:lsdException w:name="Medium Grid 1 Accent 2" w:uiPriority="67"/>
-    <w:lsdException w:name="Medium Grid 2 Accent 2" w:uiPriority="68"/>
-    <w:lsdException w:name="Medium Grid 3 Accent 2" w:uiPriority="69"/>
-    <w:lsdException w:name="Dark List Accent 2" w:uiPriority="70"/>
-    <w:lsdException w:name="Colorful Shading Accent 2" w:uiPriority="71"/>
-    <w:lsdException w:name="Colorful List Accent 2" w:uiPriority="72"/>
-    <w:lsdException w:name="Colorful Grid Accent 2" w:uiPriority="73"/>
-    <w:lsdException w:name="Light Shading Accent 3" w:uiPriority="60"/>
-    <w:lsdException w:name="Light List Accent 3" w:uiPriority="61"/>
-    <w:lsdException w:name="Light Grid Accent 3" w:uiPriority="62"/>
-    <w:lsdException w:name="Medium Shading 1 Accent 3" w:uiPriority="63"/>
-    <w:lsdException w:name="Medium Shading 2 Accent 3" w:uiPriority="64"/>
-    <w:lsdException w:name="Medium List 1 Accent 3" w:uiPriority="65"/>
-    <w:lsdException w:name="Medium List 2 Accent 3" w:uiPriority="66"/>
-    <w:lsdException w:name="Medium Grid 1 Accent 3" w:uiPriority="67"/>
-    <w:lsdException w:name="Medium Grid 2 Accent 3" w:uiPriority="68"/>
-    <w:lsdException w:name="Medium Grid 3 Accent 3" w:uiPriority="69"/>
-    <w:lsdException w:name="Dark List Accent 3" w:uiPriority="70"/>
-    <w:lsdException w:name="Colorful Shading Accent 3" w:uiPriority="71"/>
-    <w:lsdException w:name="Colorful List Accent 3" w:uiPriority="72"/>
-    <w:lsdException w:name="Colorful Grid Accent 3" w:uiPriority="73"/>
-    <w:lsdException w:name="Light Shading Accent 4" w:uiPriority="60"/>
-    <w:lsdException w:name="Light List Accent 4" w:uiPriority="61"/>
-    <w:lsdException w:name="Light Grid Accent 4" w:uiPriority="62"/>
-    <w:lsdException w:name="Medium Shading 1 Accent 4" w:uiPriority="63"/>
-    <w:lsdException w:name="Medium Shading 2 Accent 4" w:uiPriority="64"/>
-    <w:lsdException w:name="Medium List 1 Accent 4" w:uiPriority="65"/>
-    <w:lsdException w:name="Medium List 2 Accent 4" w:uiPriority="66"/>
-    <w:lsdException w:name="Medium Grid 1 Accent 4" w:uiPriority="67"/>
-    <w:lsdException w:name="Medium Grid 2 Accent 4" w:uiPriority="68"/>
-    <w:lsdException w:name="Medium Grid 3 Accent 4" w:uiPriority="69"/>
-    <w:lsdException w:name="Dark List Accent 4" w:uiPriority="70"/>
-    <w:lsdException w:name="Colorful Shading Accent 4" w:uiPriority="71"/>
-    <w:lsdException w:name="Colorful List Accent 4" w:uiPriority="72"/>
-    <w:lsdException w:name="Colorful Grid Accent 4" w:uiPriority="73"/>
-    <w:lsdException w:name="Light Shading Accent 5" w:uiPriority="60"/>
-    <w:lsdException w:name="Light List Accent 5" w:uiPriority="61"/>
-    <w:lsdException w:name="Light Grid Accent 5" w:uiPriority="62"/>
-    <w:lsdException w:name="Medium Shading 1 Accent 5" w:uiPriority="63"/>
-    <w:lsdException w:name="Medium Shading 2 Accent 5" w:uiPriority="64"/>
-    <w:lsdException w:name="Medium List 1 Accent 5" w:uiPriority="65"/>
-    <w:lsdException w:name="Medium List 2 Accent 5" w:uiPriority="66"/>
-    <w:lsdException w:name="Medium Grid 1 Accent 5" w:uiPriority="67"/>
-    <w:lsdException w:name="Medium Grid 2 Accent 5" w:uiPriority="68"/>
-    <w:lsdException w:name="Medium Grid 3 Accent 5" w:uiPriority="69"/>
-    <w:lsdException w:name="Dark List Accent 5" w:uiPriority="70"/>
-    <w:lsdException w:name="Colorful Shading Accent 5" w:uiPriority="71"/>
-    <w:lsdException w:name="Colorful List Accent 5" w:uiPriority="72"/>
-    <w:lsdException w:name="Colorful Grid Accent 5" w:uiPriority="73"/>
-    <w:lsdException w:name="Light Shading Accent 6" w:uiPriority="60"/>
-    <w:lsdException w:name="Light List Accent 6" w:uiPriority="61"/>
-    <w:lsdException w:name="Light Grid Accent 6" w:uiPriority="62"/>
-    <w:lsdException w:name="Medium Shading 1 Accent 6" w:uiPriority="63"/>
-    <w:lsdException w:name="Medium Shading 2 Accent 6" w:uiPriority="64"/>
-    <w:lsdException w:name="Medium List 1 Accent 6" w:uiPriority="65"/>
-    <w:lsdException w:name="Medium List 2 Accent 6" w:uiPriority="66"/>
-    <w:lsdException w:name="Medium Grid 1 Accent 6" w:uiPriority="67"/>
-    <w:lsdException w:name="Medium Grid 2 Accent 6" w:uiPriority="68"/>
-    <w:lsdException w:name="Medium Grid 3 Accent 6" w:uiPriority="69"/>
-    <w:lsdException w:name="Dark List Accent 6" w:uiPriority="70"/>
-    <w:lsdException w:name="Colorful Shading Accent 6" w:uiPriority="71"/>
-    <w:lsdException w:name="Colorful List Accent 6" w:uiPriority="72"/>
-    <w:lsdException w:name="Colorful Grid Accent 6" w:uiPriority="73"/>
-    <w:lsdException w:name="Subtle Emphasis" w:uiPriority="19" w:qFormat="1"/>
-    <w:lsdException w:name="Intense Emphasis" w:uiPriority="21" w:qFormat="1"/>
-    <w:lsdException w:name="Subtle Reference" w:uiPriority="31" w:qFormat="1"/>
-    <w:lsdException w:name="Intense Reference" w:uiPriority="32" w:qFormat="1"/>
-    <w:lsdException w:name="Book Title" w:uiPriority="33" w:qFormat="1"/>
-    <w:lsdException w:name="Bibliography" w:semiHidden="1" w:uiPriority="37" w:unhideWhenUsed="1"/>
-    <w:lsdException w:name="TOC Heading" w:semiHidden="1" w:uiPriority="39" w:unhideWhenUsed="1" w:qFormat="1"/>
-    <w:lsdException w:name="Plain Table 1" w:uiPriority="41"/>
-    <w:lsdException w:name="Plain Table 2" w:uiPriority="42"/>
-    <w:lsdException w:name="Plain Table 3" w:uiPriority="43"/>
-    <w:lsdException w:name="Plain Table 4" w:uiPriority="44"/>
-    <w:lsdException w:name="Plain Table 5" w:uiPriority="45"/>
-    <w:lsdException w:name="Grid Table Light" w:uiPriority="40"/>
-    <w:lsdException w:name="Grid Table 1 Light" w:uiPriority="46"/>
-    <w:lsdException w:name="Grid Table 2" w:uiPriority="47"/>
-    <w:lsdException w:name="Grid Table 3" w:uiPriority="48"/>
-    <w:lsdException w:name="Grid Table 4" w:uiPriority="49"/>
-    <w:lsdException w:name="Grid Table 5 Dark" w:uiPriority="50"/>
-    <w:lsdException w:name="Grid Table 6 Colorful" w:uiPriority="51"/>
-    <w:lsdException w:name="Grid Table 7 Colorful" w:uiPriority="52"/>
-    <w:lsdException w:name="Grid Table 1 Light Accent 1" w:uiPriority="46"/>
-    <w:lsdException w:name="Grid Table 2 Accent 1" w:uiPriority="47"/>
-    <w:lsdException w:name="Grid Table 3 Accent 1" w:uiPriority="48"/>
-    <w:lsdException w:name="Grid Table 4 Accent 1" w:uiPriority="49"/>
-    <w:lsdException w:name="Grid Table 5 Dark Accent 1" w:uiPriority="50"/>
-    <w:lsdException w:name="Grid Table 6 Colorful Accent 1" w:uiPriority="51"/>
-    <w:lsdException w:name="Grid Table 7 Colorful Accent 1" w:uiPriority="52"/>
-    <w:lsdException w:name="Grid Table 1 Light Accent 2" w:uiPriority="46"/>
-    <w:lsdException w:name="Grid Table 2 Accent 2" w:uiPriority="47"/>
-    <w:lsdException w:name="Grid Table 3 Accent 2" w:uiPriority="48"/>
-    <w:lsdException w:name="Grid Table 4 Accent 2" w:uiPriority="49"/>
-    <w:lsdException w:name="Grid Table 5 Dark Accent 2" w:uiPriority="50"/>
-    <w:lsdException w:name="Grid Table 6 Colorful Accent 2" w:uiPriority="51"/>
-    <w:lsdException w:name="Grid Table 7 Colorful Accent 2" w:uiPriority="52"/>
-    <w:lsdException w:name="Grid Table 1 Light Accent 3" w:uiPriority="46"/>
-    <w:lsdException w:name="Grid Table 2 Accent 3" w:uiPriority="47"/>
-    <w:lsdException w:name="Grid Table 3 Accent 3" w:uiPriority="48"/>
-    <w:lsdException w:name="Grid Table 4 Accent 3" w:uiPriority="49"/>
-    <w:lsdException w:name="Grid Table 5 Dark Accent 3" w:uiPriority="50"/>
-    <w:lsdException w:name="Grid Table 6 Colorful Accent 3" w:uiPriority="51"/>
-    <w:lsdException w:name="Grid Table 7 Colorful Accent 3" w:uiPriority="52"/>
-    <w:lsdException w:name="Grid Table 1 Light Accent 4" w:uiPriority="46"/>
-    <w:lsdException w:name="Grid Table 2 Accent 4" w:uiPriority="47"/>
-    <w:lsdException w:name="Grid Table 3 Accent 4" w:uiPriority="48"/>
-    <w:lsdException w:name="Grid Table 4 Accent 4" w:uiPriority="49"/>
-    <w:lsdException w:name="Grid Table 5 Dark Accent 4" w:uiPriority="50"/>
-    <w:lsdException w:name="Grid Table 6 Colorful Accent 4" w:uiPriority="51"/>
-    <w:lsdException w:name="Grid Table 7 Colorful Accent 4" w:uiPriority="52"/>
-    <w:lsdException w:name="Grid Table 1 Light Accent 5" w:uiPriority="46"/>
-    <w:lsdException w:name="Grid Table 2 Accent 5" w:uiPriority="47"/>
-    <w:lsdException w:name="Grid Table 3 Accent 5" w:uiPriority="48"/>
-    <w:lsdException w:name="Grid Table 4 Accent 5" w:uiPriority="49"/>
-    <w:lsdException w:name="Grid Table 5 Dark Accent 5" w:uiPriority="50"/>
-    <w:lsdException w:name="Grid Table 6 Colorful Accent 5" w:uiPriority="51"/>
-    <w:lsdException w:name="Grid Table 7 Colorful Accent 5" w:uiPriority="52"/>
-    <w:lsdException w:name="Grid Table 1 Light Accent 6" w:uiPriority="46"/>
-    <w:lsdException w:name="Grid Table 2 Accent 6" w:uiPriority="47"/>
-    <w:lsdException w:name="Grid Table 3 Accent 6" w:uiPriority="48"/>
-    <w:lsdException w:name="Grid Table 4 Accent 6" w:uiPriority="49"/>
-    <w:lsdException w:name="Grid Table 5 Dark Accent 6" w:uiPriority="50"/>
-    <w:lsdException w:name="Grid Table 6 Colorful Accent 6" w:uiPriority="51"/>
-    <w:lsdException w:name="Grid Table 7 Colorful Accent 6" w:uiPriority="52"/>
-    <w:lsdException w:name="List Table 1 Light" w:uiPriority="46"/>
-    <w:lsdException w:name="List Table 2" w:uiPriority="47"/>
-    <w:lsdException w:name="List Table 3" w:uiPriority="48"/>
-    <w:lsdException w:name="List Table 4" w:uiPriority="49"/>
-    <w:lsdException w:name="List Table 5 Dark" w:uiPriority="50"/>
-    <w:lsdException w:name="List Table 6 Colorful" w:uiPriority="51"/>
-    <w:lsdException w:name="List Table 7 Colorful" w:uiPriority="52"/>
-    <w:lsdException w:name="List Table 1 Light Accent 1" w:uiPriority="46"/>
-    <w:lsdException w:name="List Table 2 Accent 1" w:uiPriority="47"/>
-    <w:lsdException w:name="List Table 3 Accent 1" w:uiPriority="48"/>
-    <w:lsdException w:name="List Table 4 Accent 1" w:uiPriority="49"/>
-    <w:lsdException w:name="List Table 5 Dark Accent 1" w:uiPriority="50"/>
-    <w:lsdException w:name="List Table 6 Colorful Accent 1" w:uiPriority="51"/>
-    <w:lsdException w:name="List Table 7 Colorful Accent 1" w:uiPriority="52"/>
-    <w:lsdException w:name="List Table 1 Light Accent 2" w:uiPriority="46"/>
-    <w:lsdException w:name="List Table 2 Accent 2" w:uiPriority="47"/>
-    <w:lsdException w:name="List Table 3 Accent 2" w:uiPriority="48"/>
-    <w:lsdException w:name="List Table 4 Accent 2" w:uiPriority="49"/>
-    <w:lsdException w:name="List Table 5 Dark Accent 2" w:uiPriority="50"/>
-    <w:lsdException w:name="List Table 6 Colorful Accent 2" w:uiPriority="51"/>
-    <w:lsdException w:name="List Table 7 Colorful Accent 2" w:uiPriority="52"/>
-    <w:lsdException w:name="List Table 1 Light Accent 3" w:uiPriority="46"/>
-    <w:lsdException w:name="List Table 2 Accent 3" w:uiPriority="47"/>
-    <w:lsdException w:name="List Table 3 Accent 3" w:uiPriority="48"/>
-    <w:lsdException w:name="List Table 4 Accent 3" w:uiPriority="49"/>
-    <w:lsdException w:name="List Table 5 Dark Accent 3" w:uiPriority="50"/>
-    <w:lsdException w:name="List Table 6 Colorful Accent 3" w:uiPriority="51"/>
-    <w:lsdException w:name="List Table 7 Colorful Accent 3" w:uiPriority="52"/>
-    <w:lsdException w:name="List Table 1 Light Accent 4" w:uiPriority="46"/>
-    <w:lsdException w:name="List Table 2 Accent 4" w:uiPriority="47"/>
-    <w:lsdException w:name="List Table 3 Accent 4" w:uiPriority="48"/>
-    <w:lsdException w:name="List Table 4 Accent 4" w:uiPriority="49"/>
-    <w:lsdException w:name="List Table 5 Dark Accent 4" w:uiPriority="50"/>
-    <w:lsdException w:name="List Table 6 Colorful Accent 4" w:uiPriority="51"/>
-    <w:lsdException w:name="List Table 7 Colorful Accent 4" w:uiPriority="52"/>
-    <w:lsdException w:name="List Table 1 Light Accent 5" w:uiPriority="46"/>
-    <w:lsdException w:name="List Table 2 Accent 5" w:uiPriority="47"/>
-    <w:lsdException w:name="List Table 3 Accent 5" w:uiPriority="48"/>
-    <w:lsdException w:name="List Table 4 Accent 5" w:uiPriority="49"/>
-    <w:lsdException w:name="List Table 5 Dark Accent 5" w:uiPriority="50"/>
-    <w:lsdException w:name="List Table 6 Colorful Accent 5" w:uiPriority="51"/>
-    <w:lsdException w:name="List Table 7 Colorful Accent 5" w:uiPriority="52"/>
-    <w:lsdException w:name="List Table 1 Light Accent 6" w:uiPriority="46"/>
-    <w:lsdException w:name="List Table 2 Accent 6" w:uiPriority="47"/>
-    <w:lsdException w:name="List Table 3 Accent 6" w:uiPriority="48"/>
-    <w:lsdException w:name="List Table 4 Accent 6" w:uiPriority="49"/>
-    <w:lsdException w:name="List Table 5 Dark Accent 6" w:uiPriority="50"/>
-    <w:lsdException w:name="List Table 6 Colorful Accent 6" w:uiPriority="51"/>
-    <w:lsdException w:name="List Table 7 Colorful Accent 6" w:uiPriority="52"/>
-  </w:latentStyles>
-  <w:style w:type="paragraph" w:default="1" w:styleId="Normal">
-    <w:name w:val="Normal"/>
-    <w:qFormat/>
-  </w:style>
-  <w:style w:type="character" w:default="1" w:styleId="Fuentedeprrafopredeter">
-    <w:name w:val="Default Paragraph Font"/>
-    <w:uiPriority w:val="1"/>
-    <w:semiHidden/>
-    <w:unhideWhenUsed/>
-  </w:style>
-  <w:style w:type="table" w:default="1" w:styleId="Tablanormal">
-    <w:name w:val="Normal Table"/>
-    <w:uiPriority w:val="99"/>
-    <w:semiHidden/>
-    <w:unhideWhenUsed/>
-    <w:tblPr>
-      <w:tblInd w:w="0" w:type="dxa"/>
-      <w:tblCellMar>
-        <w:top w:w="0" w:type="dxa"/>
-        <w:left w:w="108" w:type="dxa"/>
-        <w:bottom w:w="0" w:type="dxa"/>
-        <w:right w:w="108" w:type="dxa"/>
-      </w:tblCellMar>
-    </w:tblPr>
-  </w:style>
-  <w:style w:type="numbering" w:default="1" w:styleId="Sinlista">
-    <w:name w:val="No List"/>
-    <w:uiPriority w:val="99"/>
-    <w:semiHidden/>
-    <w:unhideWhenUsed/>
-  </w:style>
-</w:styles>
-</file>
-
-<file path=word/glossary/webSettings.xml><?xml version="1.0" encoding="utf-8"?>
-<w:webSettings xmlns:mc="http://schemas.openxmlformats.org/markup-compatibility/2006" xmlns:r="http://schemas.openxmlformats.org/officeDocument/2006/relationships" xmlns:w="http://schemas.openxmlformats.org/wordprocessingml/2006/main" xmlns:w14="http://schemas.microsoft.com/office/word/2010/wordml" xmlns:w15="http://schemas.microsoft.com/office/word/2012/wordml" xmlns:w16se="http://schemas.microsoft.com/office/word/2015/wordml/symex" mc:Ignorable="w14 w15 w16se"/>
 </file>
 
 <file path=word/theme/theme1.xml><?xml version="1.0" encoding="utf-8"?>
@@ -9000,6 +8421,25 @@
 </file>
 
 <file path=customXml/item1.xml><?xml version="1.0" encoding="utf-8"?>
+<b:Sources xmlns:b="http://schemas.openxmlformats.org/officeDocument/2006/bibliography" xmlns="http://schemas.openxmlformats.org/officeDocument/2006/bibliography" SelectedStyle="\APASixthEditionOfficeOnline.xsl" StyleName="APA" Version="6"/>
+</file>
+
+<file path=customXml/item2.xml><?xml version="1.0" encoding="utf-8"?>
+<?mso-contentType ?>
+<FormTemplates xmlns="http://schemas.microsoft.com/sharepoint/v3/contenttype/forms">
+  <Display>DocumentLibraryForm</Display>
+  <Edit>DocumentLibraryForm</Edit>
+  <New>DocumentLibraryForm</New>
+</FormTemplates>
+</file>
+
+<file path=customXml/item3.xml><?xml version="1.0" encoding="utf-8"?>
+<p:properties xmlns:p="http://schemas.microsoft.com/office/2006/metadata/properties" xmlns:xsi="http://www.w3.org/2001/XMLSchema-instance" xmlns:pc="http://schemas.microsoft.com/office/infopath/2007/PartnerControls">
+  <documentManagement/>
+</p:properties>
+</file>
+
+<file path=customXml/item4.xml><?xml version="1.0" encoding="utf-8"?>
 <ct:contentTypeSchema xmlns:ct="http://schemas.microsoft.com/office/2006/metadata/contentType" xmlns:ma="http://schemas.microsoft.com/office/2006/metadata/properties/metaAttributes" ct:_="" ma:_="" ma:contentTypeName="Documento" ma:contentTypeID="0x010100E96778489EE7714D8BD12CC105EB918B" ma:contentTypeVersion="2" ma:contentTypeDescription="Crear nuevo documento." ma:contentTypeScope="" ma:versionID="416c5c7ae9b5d54d83875cd3c65194e3">
   <xsd:schema xmlns:xsd="http://www.w3.org/2001/XMLSchema" xmlns:xs="http://www.w3.org/2001/XMLSchema" xmlns:p="http://schemas.microsoft.com/office/2006/metadata/properties" xmlns:ns2="126e8a1c-9ea9-435a-ac89-d06c80d62e30" targetNamespace="http://schemas.microsoft.com/office/2006/metadata/properties" ma:root="true" ma:fieldsID="70a237c842677bd850644f8595079f5e" ns2:_="">
     <xsd:import namespace="126e8a1c-9ea9-435a-ac89-d06c80d62e30"/>
@@ -9131,26 +8571,32 @@
 </ct:contentTypeSchema>
 </file>
 
-<file path=customXml/item2.xml><?xml version="1.0" encoding="utf-8"?>
-<p:properties xmlns:p="http://schemas.microsoft.com/office/2006/metadata/properties" xmlns:xsi="http://www.w3.org/2001/XMLSchema-instance" xmlns:pc="http://schemas.microsoft.com/office/infopath/2007/PartnerControls">
-  <documentManagement/>
-</p:properties>
+<file path=customXml/itemProps1.xml><?xml version="1.0" encoding="utf-8"?>
+<ds:datastoreItem xmlns:ds="http://schemas.openxmlformats.org/officeDocument/2006/customXml" ds:itemID="{FBD61725-A60E-40F3-AB5D-0E7F797DD77D}">
+  <ds:schemaRefs>
+    <ds:schemaRef ds:uri="http://schemas.openxmlformats.org/officeDocument/2006/bibliography"/>
+  </ds:schemaRefs>
+</ds:datastoreItem>
 </file>
 
-<file path=customXml/item3.xml><?xml version="1.0" encoding="utf-8"?>
-<?mso-contentType ?>
-<FormTemplates xmlns="http://schemas.microsoft.com/sharepoint/v3/contenttype/forms">
-  <Display>DocumentLibraryForm</Display>
-  <Edit>DocumentLibraryForm</Edit>
-  <New>DocumentLibraryForm</New>
-</FormTemplates>
+<file path=customXml/itemProps2.xml><?xml version="1.0" encoding="utf-8"?>
+<ds:datastoreItem xmlns:ds="http://schemas.openxmlformats.org/officeDocument/2006/customXml" ds:itemID="{DABAA964-10BA-4DBC-ABF2-CDEAC0FAF7AA}">
+  <ds:schemaRefs>
+    <ds:schemaRef ds:uri="http://schemas.microsoft.com/sharepoint/v3/contenttype/forms"/>
+  </ds:schemaRefs>
+</ds:datastoreItem>
 </file>
 
-<file path=customXml/item4.xml><?xml version="1.0" encoding="utf-8"?>
-<b:Sources xmlns:b="http://schemas.openxmlformats.org/officeDocument/2006/bibliography" xmlns="http://schemas.openxmlformats.org/officeDocument/2006/bibliography" SelectedStyle="\APASixthEditionOfficeOnline.xsl" StyleName="APA" Version="6"/>
+<file path=customXml/itemProps3.xml><?xml version="1.0" encoding="utf-8"?>
+<ds:datastoreItem xmlns:ds="http://schemas.openxmlformats.org/officeDocument/2006/customXml" ds:itemID="{5F1783E3-BA1C-4CA3-8E32-C9B378BBED03}">
+  <ds:schemaRefs>
+    <ds:schemaRef ds:uri="http://schemas.microsoft.com/office/2006/metadata/properties"/>
+    <ds:schemaRef ds:uri="http://schemas.microsoft.com/office/infopath/2007/PartnerControls"/>
+  </ds:schemaRefs>
+</ds:datastoreItem>
 </file>
 
-<file path=customXml/itemProps1.xml><?xml version="1.0" encoding="utf-8"?>
+<file path=customXml/itemProps4.xml><?xml version="1.0" encoding="utf-8"?>
 <ds:datastoreItem xmlns:ds="http://schemas.openxmlformats.org/officeDocument/2006/customXml" ds:itemID="{DF0582E6-0C2C-40A6-8E3D-E410E41021C1}">
   <ds:schemaRefs>
     <ds:schemaRef ds:uri="http://schemas.microsoft.com/office/2006/metadata/contentType"/>
@@ -9166,36 +8612,4 @@
     <ds:schemaRef ds:uri="http://schemas.microsoft.com/internal/obd"/>
   </ds:schemaRefs>
 </ds:datastoreItem>
-</file>
-
-<file path=customXml/itemProps2.xml><?xml version="1.0" encoding="utf-8"?>
-<ds:datastoreItem xmlns:ds="http://schemas.openxmlformats.org/officeDocument/2006/customXml" ds:itemID="{5F1783E3-BA1C-4CA3-8E32-C9B378BBED03}">
-  <ds:schemaRefs>
-    <ds:schemaRef ds:uri="http://schemas.openxmlformats.org/package/2006/metadata/core-properties"/>
-    <ds:schemaRef ds:uri="http://schemas.microsoft.com/office/infopath/2007/PartnerControls"/>
-    <ds:schemaRef ds:uri="http://purl.org/dc/elements/1.1/"/>
-    <ds:schemaRef ds:uri="http://schemas.microsoft.com/office/2006/documentManagement/types"/>
-    <ds:schemaRef ds:uri="http://schemas.microsoft.com/office/2006/metadata/properties"/>
-    <ds:schemaRef ds:uri="126e8a1c-9ea9-435a-ac89-d06c80d62e30"/>
-    <ds:schemaRef ds:uri="http://purl.org/dc/terms/"/>
-    <ds:schemaRef ds:uri="http://purl.org/dc/dcmitype/"/>
-    <ds:schemaRef ds:uri="http://www.w3.org/XML/1998/namespace"/>
-  </ds:schemaRefs>
-</ds:datastoreItem>
-</file>
-
-<file path=customXml/itemProps3.xml><?xml version="1.0" encoding="utf-8"?>
-<ds:datastoreItem xmlns:ds="http://schemas.openxmlformats.org/officeDocument/2006/customXml" ds:itemID="{DABAA964-10BA-4DBC-ABF2-CDEAC0FAF7AA}">
-  <ds:schemaRefs>
-    <ds:schemaRef ds:uri="http://schemas.microsoft.com/sharepoint/v3/contenttype/forms"/>
-  </ds:schemaRefs>
-</ds:datastoreItem>
-</file>
-
-<file path=customXml/itemProps4.xml><?xml version="1.0" encoding="utf-8"?>
-<ds:datastoreItem xmlns:ds="http://schemas.openxmlformats.org/officeDocument/2006/customXml" ds:itemID="{FBD61725-A60E-40F3-AB5D-0E7F797DD77D}">
-  <ds:schemaRefs>
-    <ds:schemaRef ds:uri="http://schemas.openxmlformats.org/officeDocument/2006/bibliography"/>
-  </ds:schemaRefs>
-</ds:datastoreItem>
 </file>
</xml_diff>